<commit_message>
docs: move character design and visual pilot before voice rehearsal
</commit_message>
<xml_diff>
--- a/docs/她头顶有弹幕/她头顶有弹幕_背景与前10集_第二稿.docx
+++ b/docs/她头顶有弹幕/她头顶有弹幕_背景与前10集_第二稿.docx
@@ -13,7 +13,7 @@
     </w:p>
     <w:p>
       <w:r>
-        <w:t>背景设定、人物小传与前十集剧本｜第二稿 v2.0</w:t>
+        <w:t>背景设定、人物小传与前十集剧本｜第二稿 v2.1</w:t>
       </w:r>
     </w:p>
     <w:p>
@@ -28,7 +28,7 @@
     </w:p>
     <w:p>
       <w:r>
-        <w:t>本稿为可进入配音试读与动态分镜验证的文学剧本。单集以竖屏 60–90 秒为目标；文中节拍时间是创作预算，尚未经过配音和剪辑实测。正式发行平台、总集数和制作工具待试播结果与发行需求确定。</w:t>
+        <w:t>本稿为可进入人物定妆、分镜与画面样片、配音试读三个阶段的文学剧本，按此顺序执行。单集以竖屏 60–90 秒为目标；文中节拍时间是创作预算，尚未经过配音和剪辑实测。正式发行平台、总集数和制作工具待试播结果与发行需求确定。</w:t>
       </w:r>
     </w:p>
     <w:p>
@@ -4346,7 +4346,12 @@
         <w:pStyle w:val="Heading2"/>
       </w:pPr>
       <w:r>
-        <w:t>推荐顺序</w:t>
+        <w:t>已确认的制作顺序</w:t>
+      </w:r>
+    </w:p>
+    <w:p>
+      <w:r>
+        <w:t>按用户确认，将原来的“①配音试读、②人物定妆、③分镜与样片”调整为“②→③→①”。具体执行如下。</w:t>
       </w:r>
     </w:p>
     <w:p>
@@ -4354,7 +4359,7 @@
         <w:ind w:left="340" w:hanging="340"/>
       </w:pPr>
       <w:r>
-        <w:t>1. 先用第一集做配音试读与简易节拍分镜。朗读公开对白和弹幕，加入看字、反应、转身等必要停顿，验证 60–90 秒内笑点能听懂。暂用文字卡或草图，不必等全部角色图完成。</w:t>
+        <w:t>1. 人物定妆与人物卡（原第②步）。先为男女主各做少量定妆候选，比较脸、气质、同框与关键表情，确定一对后建立正面、侧面、全身及表情参考组。建议采用现代都市、半写实影视质感与克制喜剧表演；使用 9:16 画幅，沈宅以深木与米灰为主，肤色和光线保持温暖。视觉风格仍需通过定妆测试确定。配角按第一集需要补充，同时建立婚房场景卡、服装卡和玉佩道具卡。</w:t>
       </w:r>
     </w:p>
     <w:p>
@@ -4362,7 +4367,7 @@
         <w:ind w:left="340" w:hanging="340"/>
       </w:pPr>
       <w:r>
-        <w:t>2. 根据试读版确定最基本的视觉方向：建议现代都市、半写实影视质感、克制喜剧表演；采用 9:16 画幅，沈宅以深木与米灰为主，人物肤色和光线保持温暖。此项是待试图验证的建议，不视为用户已经选定的最终美术。</w:t>
+        <w:t>2. 第一集分镜与画面样片（原第③步）。安排约 10–14 个镜头，先出静帧分镜，再测试三至五秒的短镜头，优先验证正反打、同框脸部一致性、手持纸张、轻微转身和表情衔接。用文字占位标注对白与弹幕的出现位置，保留镜头长度和剪辑顺序的调整空间。此阶段形成画面样片，最终口型与时长留待配音阶段校准。</w:t>
       </w:r>
     </w:p>
     <w:p>
@@ -4370,39 +4375,12 @@
         <w:ind w:left="340" w:hanging="340"/>
       </w:pPr>
       <w:r>
-        <w:t>3. 制作男女主定妆测试。先各做少量候选，看脸、气质、同框和表情，确定一对之后再展开完整人物视觉卡。先锁主演，配角随样片需求建立。</w:t>
-      </w:r>
-    </w:p>
-    <w:p>
-      <w:pPr>
-        <w:ind w:left="340" w:hanging="340"/>
-      </w:pPr>
-      <w:r>
-        <w:t>4. 为确定的两张脸建立标准参考组，并为第一集建立婚房场景卡、服装卡与玉佩道具卡。</w:t>
-      </w:r>
-    </w:p>
-    <w:p>
-      <w:pPr>
-        <w:ind w:left="340" w:hanging="340"/>
-      </w:pPr>
-      <w:r>
-        <w:t>5. 第一集制作约 10–14 个镜头，先出静帧分镜，再测试三至五秒的短镜头；优先验证正反打、同框脸部一致性、手持纸张、轻微转身和表情衔接。</w:t>
-      </w:r>
-    </w:p>
-    <w:p>
-      <w:pPr>
-        <w:ind w:left="340" w:hanging="340"/>
-      </w:pPr>
-      <w:r>
-        <w:t>6. 后期加入弹幕、对白字幕、音效与配音，输出一集完整样片。检查笑点是否在字幕读完之后、反应是否及时、人物是否持续像同一个人。</w:t>
-      </w:r>
-    </w:p>
-    <w:p>
-      <w:pPr>
-        <w:ind w:left="340" w:hanging="340"/>
-      </w:pPr>
-      <w:r>
-        <w:t>7. 样片稳定后再批量生成前十集所需服装、配角与场景资产，并按复用场景组织生产。</w:t>
+        <w:t>3. 配音试读与节奏校准（原第①步）。对着画面样片朗读公开对白和弹幕，加入看字、反应、转身等必要停顿，校准每个笑点的落点与阅读时间。根据实际配音调整镜头时长、必要的口型同步和剪辑，再加入正式弹幕、对白字幕及音效，输出以 60–90 秒为目标的完整样片。检查笑点是否在字幕读完之后、反应是否及时、人物是否持续像同一个人。</w:t>
+      </w:r>
+    </w:p>
+    <w:p>
+      <w:r>
+        <w:t>完整样片稳定后，再批量生成前十集所需服装、配角与场景资产，并按复用场景组织生产。</w:t>
       </w:r>
     </w:p>
     <w:p>
@@ -4410,7 +4388,7 @@
         <w:pStyle w:val="Heading2"/>
       </w:pPr>
       <w:r>
-        <w:t>第一集试读通过标准</w:t>
+        <w:t>第一集最终样片通过标准</w:t>
       </w:r>
     </w:p>
     <w:p>
@@ -4592,7 +4570,7 @@
         <w:pStyle w:val="ListBullet"/>
       </w:pPr>
       <w:r>
-        <w:t>配音参考：各自一段中性对白、一段喜剧对白；女主另存一段心声。最终应检查两种说话状态仍像同一个人。</w:t>
+        <w:t>配音参考：在配音试读阶段补充各自一段中性对白、一段喜剧对白；女主另存一段心声。最终应检查两种说话状态仍像同一个人。</w:t>
       </w:r>
     </w:p>
     <w:p>
@@ -4624,7 +4602,7 @@
     </w:p>
     <w:p>
       <w:r>
-        <w:t>尚未发生的制作：配音试读、动态分镜、人物图像生成、视频生成、成片时长实测与平台发布。文稿中的时间预算不是对这些工作的完成声明。</w:t>
+        <w:t>尚未发生的制作：人物图像生成、动态分镜与画面样片、配音试读、成片时长实测与平台发布。文稿中的时间预算不是对这些工作的完成声明。</w:t>
       </w:r>
     </w:p>
     <w:p>
@@ -4674,7 +4652,7 @@
         <w:color w:val="687582"/>
         <w:sz w:val="16"/>
       </w:rPr>
-      <w:t>《她头顶有弹幕》 · 第二稿 v2.0 · 创作与试播工作稿</w:t>
+      <w:t>《她头顶有弹幕》 · 第二稿 v2.1 · 创作与试播工作稿</w:t>
     </w:r>
   </w:p>
 </w:hdr>

</xml_diff>

<commit_message>
assets: add episode one storyboard and horizontal video specifications
</commit_message>
<xml_diff>
--- a/docs/她头顶有弹幕/她头顶有弹幕_背景与前10集_第二稿.docx
+++ b/docs/她头顶有弹幕/她头顶有弹幕_背景与前10集_第二稿.docx
@@ -13,7 +13,7 @@
     </w:p>
     <w:p>
       <w:r>
-        <w:t>背景设定、人物小传与前十集剧本｜第二稿 v2.1</w:t>
+        <w:t>背景设定、人物小传与前十集剧本｜第二稿 v2.2</w:t>
       </w:r>
     </w:p>
     <w:p>
@@ -28,7 +28,7 @@
     </w:p>
     <w:p>
       <w:r>
-        <w:t>本稿为可进入人物定妆、分镜与画面样片、配音试读三个阶段的文学剧本，按此顺序执行。单集以竖屏 60–90 秒为目标；文中节拍时间是创作预算，尚未经过配音和剪辑实测。正式发行平台、总集数和制作工具待试播结果与发行需求确定。</w:t>
+        <w:t>本稿为可进入人物定妆、分镜与画面样片、配音试读三个阶段的文学剧本，按此顺序执行。按用户最新确认，单集以 16:9 横屏、60–90 秒为目标，第一集采用 24 镜头、约 75 秒的分镜预算；文中节拍时间尚未经过配音和剪辑实测。正式发行平台、总集数和制作工具待试播结果与发行需求确定。</w:t>
       </w:r>
     </w:p>
     <w:p>
@@ -1245,7 +1245,9 @@
         </w:tc>
       </w:tr>
     </w:tbl>
-    <w:p/>
+    <w:p>
+      <w:r/>
+    </w:p>
     <w:p>
       <w:r>
         <w:t>固定空间优先复用：沈宅卧室、客厅与餐桌、书房。视界科技会议室在第十集出现；第八集母亲通过通话出现，避免为一次对话增加外景。前十集不拍大婚礼、商会群像、整间工厂或城市航拍。</w:t>
@@ -1286,7 +1288,7 @@
         <w:keepNext/>
       </w:pPr>
       <w:r>
-        <w:t>时间预算：0–8 秒钩子；8–30 秒确认异常；30–65 秒规则改写；65–85 秒床归她与疑问。</w:t>
+        <w:t>时间预算：24 镜头，共约 75 秒。0–18 秒确认异常；18–41 秒规则改写；41–62 秒询问要求并让床；62–75 秒女主起疑、男主藏笑。详见第一集横屏分镜。</w:t>
       </w:r>
     </w:p>
     <w:p>
@@ -1392,7 +1394,7 @@
         <w:rPr>
           <w:color w:val="4D5860"/>
         </w:rPr>
-        <w:t>△ 他把玉佩压在纸边，重新拿起笔。</w:t>
+        <w:t>△ 他把玉佩移到纸张左上方的桌面，重新拿起笔。</w:t>
       </w:r>
     </w:p>
     <w:p>
@@ -1535,7 +1537,86 @@
         <w:rPr>
           <w:color w:val="4D5860"/>
         </w:rPr>
-        <w:t>△ 她嘴角刚翘起来，又立刻收住，看了看自己的嘴。</w:t>
+        <w:t>△ 她嘴角刚翘起来，又立刻收住，指尖轻触自己的嘴边。</w:t>
+      </w:r>
+    </w:p>
+    <w:p>
+      <w:r>
+        <w:rPr>
+          <w:b/>
+          <w:color w:val="926050"/>
+        </w:rPr>
+        <w:t>心声·仅观众：【等一下。我刚才说出来了？】</w:t>
+      </w:r>
+    </w:p>
+    <w:p>
+      <w:r>
+        <w:rPr>
+          <w:color w:val="4D5860"/>
+        </w:rPr>
+        <w:t>△ 沈既白背对她，把枕头摆正。嘴角终于失守一下。</w:t>
+      </w:r>
+    </w:p>
+    <w:p>
+      <w:r>
+        <w:t>剪辑点：停在两人对同一件事完全不同的表情上。</w:t>
+      </w:r>
+    </w:p>
+    <w:p>
+      <w:r>
+        <w:t>制作提示：玉佩仅一个插入镜头；纸上不必展示整份条款。弹幕需在后期排版，不跟随复杂头部运动。</w:t>
+      </w:r>
+    </w:p>
+    <w:p>
+      <w:pPr>
+        <w:pStyle w:val="Heading2"/>
+        <w:pageBreakBefore/>
+      </w:pPr>
+      <w:r>
+        <w:t>第2集《员工加餐》</w:t>
+      </w:r>
+    </w:p>
+    <w:p>
+      <w:pPr>
+        <w:keepNext/>
+      </w:pPr>
+      <w:r>
+        <w:t>本集目标：首次按弹幕满足小愿望；立即让女主反过来照顾男主，形成双向关系。</w:t>
+      </w:r>
+    </w:p>
+    <w:p>
+      <w:pPr>
+        <w:keepNext/>
+      </w:pPr>
+      <w:r>
+        <w:t>时间预算：0–12 秒假装喜欢健康餐；12–38 秒借口开饭；38–72 秒男主怕辣；72–88 秒互相留面子。</w:t>
+      </w:r>
+    </w:p>
+    <w:p>
+      <w:pPr>
+        <w:keepNext/>
+      </w:pPr>
+      <w:r>
+        <w:t>场景一：次日早晨，沈宅·餐厅。桌上是沙拉与牛奶。</w:t>
+      </w:r>
+    </w:p>
+    <w:p>
+      <w:r>
+        <w:rPr>
+          <w:color w:val="4D5860"/>
+        </w:rPr>
+        <w:t>△ 温书窈用叉子挑起一片菜叶，笑得很标准。</w:t>
+      </w:r>
+    </w:p>
+    <w:p>
+      <w:r>
+        <w:rPr>
+          <w:b/>
+        </w:rPr>
+        <w:t>温书窈：</w:t>
+      </w:r>
+      <w:r>
+        <w:t>清淡点，挺好的。</w:t>
       </w:r>
     </w:p>
     <w:p>
@@ -1550,7 +1631,7 @@
         <w:rPr>
           <w:color w:val="926050"/>
         </w:rPr>
-        <w:t>【等一下。我刚才说出来了？】</w:t>
+        <w:t>【嘴在吃草，灵魂想吃螺蛳粉。】</w:t>
       </w:r>
     </w:p>
     <w:p>
@@ -1558,58 +1639,18 @@
         <w:rPr>
           <w:color w:val="4D5860"/>
         </w:rPr>
-        <w:t>△ 沈既白背对她，把枕头摆正。嘴角终于失守一下。</w:t>
-      </w:r>
-    </w:p>
-    <w:p>
-      <w:r>
-        <w:t>剪辑点：停在两人对同一件事完全不同的表情上。</w:t>
-      </w:r>
-    </w:p>
-    <w:p>
-      <w:r>
-        <w:t>制作提示：玉佩仅一个插入镜头；纸上不必展示整份条款。弹幕需在后期排版，不跟随复杂头部运动。</w:t>
-      </w:r>
-    </w:p>
-    <w:p>
-      <w:pPr>
-        <w:pStyle w:val="Heading2"/>
-        <w:pageBreakBefore/>
-      </w:pPr>
-      <w:r>
-        <w:t>第2集《员工加餐》</w:t>
-      </w:r>
-    </w:p>
-    <w:p>
-      <w:pPr>
-        <w:keepNext/>
-      </w:pPr>
-      <w:r>
-        <w:t>本集目标：首次按弹幕满足小愿望；立即让女主反过来照顾男主，形成双向关系。</w:t>
-      </w:r>
-    </w:p>
-    <w:p>
-      <w:pPr>
-        <w:keepNext/>
-      </w:pPr>
-      <w:r>
-        <w:t>时间预算：0–12 秒假装喜欢健康餐；12–38 秒借口开饭；38–72 秒男主怕辣；72–88 秒互相留面子。</w:t>
-      </w:r>
-    </w:p>
-    <w:p>
-      <w:pPr>
-        <w:keepNext/>
-      </w:pPr>
-      <w:r>
-        <w:t>场景一：次日早晨，沈宅·餐厅。桌上是沙拉与牛奶。</w:t>
+        <w:t>△ 沈既白看一眼她头顶的字，在手机上给顾言之发出三个字：“螺蛳粉”。</w:t>
       </w:r>
     </w:p>
     <w:p>
       <w:r>
         <w:rPr>
-          <w:color w:val="4D5860"/>
+          <w:b/>
         </w:rPr>
-        <w:t>△ 温书窈用叉子挑起一片菜叶，笑得很标准。</w:t>
+        <w:t>沈既白：</w:t>
+      </w:r>
+      <w:r>
+        <w:t>中午加餐。</w:t>
       </w:r>
     </w:p>
     <w:p>
@@ -1620,7 +1661,75 @@
         <w:t>温书窈：</w:t>
       </w:r>
       <w:r>
-        <w:t>清淡点，挺好的。</w:t>
+        <w:t>什么加餐？</w:t>
+      </w:r>
+    </w:p>
+    <w:p>
+      <w:r>
+        <w:rPr>
+          <w:b/>
+        </w:rPr>
+        <w:t>沈既白：</w:t>
+      </w:r>
+      <w:r>
+        <w:t>员工福利。</w:t>
+      </w:r>
+    </w:p>
+    <w:p>
+      <w:pPr>
+        <w:keepNext/>
+      </w:pPr>
+      <w:r>
+        <w:t>场景二：同日中午，仍在餐厅。桌上换成两份送来的螺蛳粉，接揭盖的近景。</w:t>
+      </w:r>
+    </w:p>
+    <w:p>
+      <w:r>
+        <w:rPr>
+          <w:b/>
+        </w:rPr>
+        <w:t>沈既白：</w:t>
+      </w:r>
+      <w:r>
+        <w:t>顾言之多订了一份。</w:t>
+      </w:r>
+    </w:p>
+    <w:p>
+      <w:r>
+        <w:rPr>
+          <w:color w:val="4D5860"/>
+        </w:rPr>
+        <w:t>△ 手机语音弹出，屏幕不展示长文字。</w:t>
+      </w:r>
+    </w:p>
+    <w:p>
+      <w:r>
+        <w:rPr>
+          <w:b/>
+        </w:rPr>
+        <w:t>顾言之（语音）：</w:t>
+      </w:r>
+      <w:r>
+        <w:t>沈总，您早上要的螺蛳粉——</w:t>
+      </w:r>
+    </w:p>
+    <w:p>
+      <w:r>
+        <w:rPr>
+          <w:color w:val="4D5860"/>
+        </w:rPr>
+        <w:t>△ 沈既白按停。她保持礼貌，眼睛已经落在炸蛋上。</w:t>
+      </w:r>
+    </w:p>
+    <w:p>
+      <w:r>
+        <w:rPr>
+          <w:b/>
+        </w:rPr>
+        <w:t>温书窈：</w:t>
+      </w:r>
+      <w:r>
+        <w:t>我不太吃这个。</w:t>
       </w:r>
     </w:p>
     <w:p>
@@ -1635,15 +1744,7 @@
         <w:rPr>
           <w:color w:val="926050"/>
         </w:rPr>
-        <w:t>【嘴在吃草，灵魂想吃螺蛳粉。】</w:t>
-      </w:r>
-    </w:p>
-    <w:p>
-      <w:r>
-        <w:rPr>
-          <w:color w:val="4D5860"/>
-        </w:rPr>
-        <w:t>△ 沈既白看一眼她头顶的字，在手机上给顾言之发出三个字：“螺蛳粉”。</w:t>
+        <w:t>【加炸蛋的。它在叫我。】</w:t>
       </w:r>
     </w:p>
     <w:p>
@@ -1654,7 +1755,15 @@
         <w:t>沈既白：</w:t>
       </w:r>
       <w:r>
-        <w:t>中午加餐。</w:t>
+        <w:t>那我倒了。</w:t>
+      </w:r>
+    </w:p>
+    <w:p>
+      <w:r>
+        <w:rPr>
+          <w:color w:val="4D5860"/>
+        </w:rPr>
+        <w:t>△ 她比他更快扶住盒沿，重新端庄坐好。</w:t>
       </w:r>
     </w:p>
     <w:p>
@@ -1665,37 +1774,7 @@
         <w:t>温书窈：</w:t>
       </w:r>
       <w:r>
-        <w:t>什么加餐？</w:t>
-      </w:r>
-    </w:p>
-    <w:p>
-      <w:r>
-        <w:rPr>
-          <w:b/>
-        </w:rPr>
-        <w:t>沈既白：</w:t>
-      </w:r>
-      <w:r>
-        <w:t>员工福利。</w:t>
-      </w:r>
-    </w:p>
-    <w:p>
-      <w:pPr>
-        <w:keepNext/>
-      </w:pPr>
-      <w:r>
-        <w:t>场景二：同日中午，仍在餐厅。桌上换成两份送来的螺蛳粉，接揭盖的近景。</w:t>
-      </w:r>
-    </w:p>
-    <w:p>
-      <w:r>
-        <w:rPr>
-          <w:b/>
-        </w:rPr>
-        <w:t>沈既白：</w:t>
-      </w:r>
-      <w:r>
-        <w:t>顾言之多订了一份。</w:t>
+        <w:t>浪费不太好。</w:t>
       </w:r>
     </w:p>
     <w:p>
@@ -1703,37 +1782,7 @@
         <w:rPr>
           <w:color w:val="4D5860"/>
         </w:rPr>
-        <w:t>△ 手机语音弹出，屏幕不展示长文字。</w:t>
-      </w:r>
-    </w:p>
-    <w:p>
-      <w:r>
-        <w:rPr>
-          <w:b/>
-        </w:rPr>
-        <w:t>顾言之（语音）：</w:t>
-      </w:r>
-      <w:r>
-        <w:t>沈总，您早上要的螺蛳粉——</w:t>
-      </w:r>
-    </w:p>
-    <w:p>
-      <w:r>
-        <w:rPr>
-          <w:color w:val="4D5860"/>
-        </w:rPr>
-        <w:t>△ 沈既白按停。她保持礼貌，眼睛已经落在炸蛋上。</w:t>
-      </w:r>
-    </w:p>
-    <w:p>
-      <w:r>
-        <w:rPr>
-          <w:b/>
-        </w:rPr>
-        <w:t>温书窈：</w:t>
-      </w:r>
-      <w:r>
-        <w:t>我不太吃这个。</w:t>
+        <w:t>△ 她先小口，再真心满足地吃了一口。沈既白为了显得自然，也尝了一筷子。喉结一动，立刻去拿水。</w:t>
       </w:r>
     </w:p>
     <w:p>
@@ -1748,7 +1797,34 @@
         <w:rPr>
           <w:color w:val="926050"/>
         </w:rPr>
-        <w:t>【加炸蛋的。它在叫我。】</w:t>
+        <w:t>【他不能吃辣？嘴硬成这样。】</w:t>
+      </w:r>
+    </w:p>
+    <w:p>
+      <w:r>
+        <w:rPr>
+          <w:color w:val="4D5860"/>
+        </w:rPr>
+        <w:t>△ 她把牛奶移到他手边，同时拿走旁边的空水杯。</w:t>
+      </w:r>
+    </w:p>
+    <w:p>
+      <w:r>
+        <w:rPr>
+          <w:b/>
+        </w:rPr>
+        <w:t>温书窈：</w:t>
+      </w:r>
+      <w:r>
+        <w:t>我开多了，沈先生帮个忙。</w:t>
+      </w:r>
+    </w:p>
+    <w:p>
+      <w:r>
+        <w:rPr>
+          <w:color w:val="4D5860"/>
+        </w:rPr>
+        <w:t>△ 他喝了，终于缓过来。她垂眼吃粉，把笑藏住。</w:t>
       </w:r>
     </w:p>
     <w:p>
@@ -1759,34 +1835,7 @@
         <w:t>沈既白：</w:t>
       </w:r>
       <w:r>
-        <w:t>那我倒了。</w:t>
-      </w:r>
-    </w:p>
-    <w:p>
-      <w:r>
-        <w:rPr>
-          <w:color w:val="4D5860"/>
-        </w:rPr>
-        <w:t>△ 她比他更快扶住盒沿，重新端庄坐好。</w:t>
-      </w:r>
-    </w:p>
-    <w:p>
-      <w:r>
-        <w:rPr>
-          <w:b/>
-        </w:rPr>
-        <w:t>温书窈：</w:t>
-      </w:r>
-      <w:r>
-        <w:t>浪费不太好。</w:t>
-      </w:r>
-    </w:p>
-    <w:p>
-      <w:r>
-        <w:rPr>
-          <w:color w:val="4D5860"/>
-        </w:rPr>
-        <w:t>△ 她先小口，再真心满足地吃了一口。沈既白为了显得自然，也尝了一筷子。喉结一动，立刻去拿水。</w:t>
+        <w:t>谢谢。</w:t>
       </w:r>
     </w:p>
     <w:p>
@@ -1801,7 +1850,7 @@
         <w:rPr>
           <w:color w:val="926050"/>
         </w:rPr>
-        <w:t>【他不能吃辣？嘴硬成这样。】</w:t>
+        <w:t>【行，给你留点总裁的尊严。】</w:t>
       </w:r>
     </w:p>
     <w:p>
@@ -1809,7 +1858,58 @@
         <w:rPr>
           <w:color w:val="4D5860"/>
         </w:rPr>
-        <w:t>△ 她把牛奶移到他手边，同时拿走旁边的空水杯。</w:t>
+        <w:t>△ 他看见这句，杯子遮住嘴角。</w:t>
+      </w:r>
+    </w:p>
+    <w:p>
+      <w:r>
+        <w:t>剪辑点：两人都在偷偷笑，谁也没有拆穿谁。</w:t>
+      </w:r>
+    </w:p>
+    <w:p>
+      <w:r>
+        <w:t>制作提示：男主先读到愿望，再发出订餐消息，最后在中午兑现。早午两场复用同一机位，用桌面食物变化与短转场交代时间，不依靠他事先知道女主口味。</w:t>
+      </w:r>
+    </w:p>
+    <w:p>
+      <w:pPr>
+        <w:pStyle w:val="Heading2"/>
+        <w:pageBreakBefore/>
+      </w:pPr>
+      <w:r>
+        <w:t>第3集《今天及格了吗》</w:t>
+      </w:r>
+    </w:p>
+    <w:p>
+      <w:pPr>
+        <w:keepNext/>
+      </w:pPr>
+      <w:r>
+        <w:t>本集目标：男主的好胜心制造升级笑点；让女主主动靠近一次。</w:t>
+      </w:r>
+    </w:p>
+    <w:p>
+      <w:pPr>
+        <w:keepNext/>
+      </w:pPr>
+      <w:r>
+        <w:t>时间预算：0–15 秒第一条差评；15–42 秒两次换领带；42–72 秒女主上手整理；72–88 秒母亲到访。</w:t>
+      </w:r>
+    </w:p>
+    <w:p>
+      <w:pPr>
+        <w:keepNext/>
+      </w:pPr>
+      <w:r>
+        <w:t>场景：同日午后，沈宅·客厅与相邻衣帽区。温书窈已换浅杏针织衫、深色半裙，正整理自己的面料色卡。</w:t>
+      </w:r>
+    </w:p>
+    <w:p>
+      <w:r>
+        <w:rPr>
+          <w:color w:val="4D5860"/>
+        </w:rPr>
+        <w:t>△ 沈既白准备出门，系着一条沉闷的灰领带。她抬头营业。</w:t>
       </w:r>
     </w:p>
     <w:p>
@@ -1820,26 +1920,7 @@
         <w:t>温书窈：</w:t>
       </w:r>
       <w:r>
-        <w:t>我开多了，沈先生帮个忙。</w:t>
-      </w:r>
-    </w:p>
-    <w:p>
-      <w:r>
-        <w:rPr>
-          <w:color w:val="4D5860"/>
-        </w:rPr>
-        <w:t>△ 他喝了，终于缓过来。她垂眼吃粉，把笑藏住。</w:t>
-      </w:r>
-    </w:p>
-    <w:p>
-      <w:r>
-        <w:rPr>
-          <w:b/>
-        </w:rPr>
-        <w:t>沈既白：</w:t>
-      </w:r>
-      <w:r>
-        <w:t>谢谢。</w:t>
+        <w:t>很精神。</w:t>
       </w:r>
     </w:p>
     <w:p>
@@ -1854,7 +1935,7 @@
         <w:rPr>
           <w:color w:val="926050"/>
         </w:rPr>
-        <w:t>【行，给你留点总裁的尊严。】</w:t>
+        <w:t>【脸九分，领带倒扣八分。】</w:t>
       </w:r>
     </w:p>
     <w:p>
@@ -1862,58 +1943,7 @@
         <w:rPr>
           <w:color w:val="4D5860"/>
         </w:rPr>
-        <w:t>△ 他看见这句，杯子遮住嘴角。</w:t>
-      </w:r>
-    </w:p>
-    <w:p>
-      <w:r>
-        <w:t>剪辑点：两人都在偷偷笑，谁也没有拆穿谁。</w:t>
-      </w:r>
-    </w:p>
-    <w:p>
-      <w:r>
-        <w:t>制作提示：男主先读到愿望，再发出订餐消息，最后在中午兑现。早午两场复用同一机位，用桌面食物变化与短转场交代时间，不依靠他事先知道女主口味。</w:t>
-      </w:r>
-    </w:p>
-    <w:p>
-      <w:pPr>
-        <w:pStyle w:val="Heading2"/>
-        <w:pageBreakBefore/>
-      </w:pPr>
-      <w:r>
-        <w:t>第3集《今天及格了吗》</w:t>
-      </w:r>
-    </w:p>
-    <w:p>
-      <w:pPr>
-        <w:keepNext/>
-      </w:pPr>
-      <w:r>
-        <w:t>本集目标：男主的好胜心制造升级笑点；让女主主动靠近一次。</w:t>
-      </w:r>
-    </w:p>
-    <w:p>
-      <w:pPr>
-        <w:keepNext/>
-      </w:pPr>
-      <w:r>
-        <w:t>时间预算：0–15 秒第一条差评；15–42 秒两次换领带；42–72 秒女主上手整理；72–88 秒母亲到访。</w:t>
-      </w:r>
-    </w:p>
-    <w:p>
-      <w:pPr>
-        <w:keepNext/>
-      </w:pPr>
-      <w:r>
-        <w:t>场景：同日午后，沈宅·客厅与相邻衣帽区。温书窈已换浅杏针织衫、深色半裙，正整理自己的面料色卡。</w:t>
-      </w:r>
-    </w:p>
-    <w:p>
-      <w:r>
-        <w:rPr>
-          <w:color w:val="4D5860"/>
-        </w:rPr>
-        <w:t>△ 沈既白准备出门，系着一条沉闷的灰领带。她抬头营业。</w:t>
+        <w:t>△ 他停步，转去衣帽区。再出来，换了条暗红领带。</w:t>
       </w:r>
     </w:p>
     <w:p>
@@ -1924,7 +1954,7 @@
         <w:t>温书窈：</w:t>
       </w:r>
       <w:r>
-        <w:t>很精神。</w:t>
+        <w:t>也好看。</w:t>
       </w:r>
     </w:p>
     <w:p>
@@ -1939,7 +1969,7 @@
         <w:rPr>
           <w:color w:val="926050"/>
         </w:rPr>
-        <w:t>【脸九分，领带倒扣八分。】</w:t>
+        <w:t>【从开会变成年会了。】</w:t>
       </w:r>
     </w:p>
     <w:p>
@@ -1947,7 +1977,7 @@
         <w:rPr>
           <w:color w:val="4D5860"/>
         </w:rPr>
-        <w:t>△ 他停步，转去衣帽区。再出来，换了条暗红领带。</w:t>
+        <w:t>△ 他看向镜子，解领带。她终于放下色卡。</w:t>
       </w:r>
     </w:p>
     <w:p>
@@ -1958,7 +1988,64 @@
         <w:t>温书窈：</w:t>
       </w:r>
       <w:r>
-        <w:t>也好看。</w:t>
+        <w:t>沈先生赶时间吗？</w:t>
+      </w:r>
+    </w:p>
+    <w:p>
+      <w:r>
+        <w:rPr>
+          <w:b/>
+        </w:rPr>
+        <w:t>沈既白：</w:t>
+      </w:r>
+      <w:r>
+        <w:t>不赶。</w:t>
+      </w:r>
+    </w:p>
+    <w:p>
+      <w:r>
+        <w:rPr>
+          <w:color w:val="4D5860"/>
+        </w:rPr>
+        <w:t>△ 桌上手机响。</w:t>
+      </w:r>
+    </w:p>
+    <w:p>
+      <w:r>
+        <w:rPr>
+          <w:b/>
+        </w:rPr>
+        <w:t>顾言之（电话音）：</w:t>
+      </w:r>
+      <w:r>
+        <w:t>车等您二十分钟了。</w:t>
+      </w:r>
+    </w:p>
+    <w:p>
+      <w:r>
+        <w:rPr>
+          <w:color w:val="4D5860"/>
+        </w:rPr>
+        <w:t>△ 沈既白按掉免提。她忍住笑，从衣架取下藏蓝领带。</w:t>
+      </w:r>
+    </w:p>
+    <w:p>
+      <w:r>
+        <w:rPr>
+          <w:b/>
+        </w:rPr>
+        <w:t>温书窈：</w:t>
+      </w:r>
+      <w:r>
+        <w:t>这条。我来？</w:t>
+      </w:r>
+    </w:p>
+    <w:p>
+      <w:r>
+        <w:rPr>
+          <w:color w:val="4D5860"/>
+        </w:rPr>
+        <w:t>△ 他点头。她走近，帮他重新整理领口。镜头落在距离突然缩短的两张脸上，复杂系结动作可省略。</w:t>
       </w:r>
     </w:p>
     <w:p>
@@ -1973,7 +2060,7 @@
         <w:rPr>
           <w:color w:val="926050"/>
         </w:rPr>
-        <w:t>【从开会变成年会了。】</w:t>
+        <w:t>【这张脸，近看还不收门票。】</w:t>
       </w:r>
     </w:p>
     <w:p>
@@ -1981,7 +2068,7 @@
         <w:rPr>
           <w:color w:val="4D5860"/>
         </w:rPr>
-        <w:t>△ 他看向镜子，解领带。她终于放下色卡。</w:t>
+        <w:t>△ 他突然站得更直。她抬眼看他。</w:t>
       </w:r>
     </w:p>
     <w:p>
@@ -1992,7 +2079,34 @@
         <w:t>温书窈：</w:t>
       </w:r>
       <w:r>
-        <w:t>沈先生赶时间吗？</w:t>
+        <w:t>低一点。</w:t>
+      </w:r>
+    </w:p>
+    <w:p>
+      <w:r>
+        <w:rPr>
+          <w:color w:val="4D5860"/>
+        </w:rPr>
+        <w:t>△ 他立刻低头。她完成整理，笑容比刚才真实。</w:t>
+      </w:r>
+    </w:p>
+    <w:p>
+      <w:r>
+        <w:rPr>
+          <w:b/>
+        </w:rPr>
+        <w:t>温书窈：</w:t>
+      </w:r>
+      <w:r>
+        <w:t>好了。</w:t>
+      </w:r>
+    </w:p>
+    <w:p>
+      <w:r>
+        <w:rPr>
+          <w:color w:val="4D5860"/>
+        </w:rPr>
+        <w:t>△ 他看一眼镜子，又看向她。</w:t>
       </w:r>
     </w:p>
     <w:p>
@@ -2003,34 +2117,7 @@
         <w:t>沈既白：</w:t>
       </w:r>
       <w:r>
-        <w:t>不赶。</w:t>
-      </w:r>
-    </w:p>
-    <w:p>
-      <w:r>
-        <w:rPr>
-          <w:color w:val="4D5860"/>
-        </w:rPr>
-        <w:t>△ 桌上手机响。</w:t>
-      </w:r>
-    </w:p>
-    <w:p>
-      <w:r>
-        <w:rPr>
-          <w:b/>
-        </w:rPr>
-        <w:t>顾言之（电话音）：</w:t>
-      </w:r>
-      <w:r>
-        <w:t>车等您二十分钟了。</w:t>
-      </w:r>
-    </w:p>
-    <w:p>
-      <w:r>
-        <w:rPr>
-          <w:color w:val="4D5860"/>
-        </w:rPr>
-        <w:t>△ 沈既白按掉免提。她忍住笑，从衣架取下藏蓝领带。</w:t>
+        <w:t>这次呢？</w:t>
       </w:r>
     </w:p>
     <w:p>
@@ -2041,15 +2128,7 @@
         <w:t>温书窈：</w:t>
       </w:r>
       <w:r>
-        <w:t>这条。我来？</w:t>
-      </w:r>
-    </w:p>
-    <w:p>
-      <w:r>
-        <w:rPr>
-          <w:color w:val="4D5860"/>
-        </w:rPr>
-        <w:t>△ 他点头。她走近，帮他重新整理领口。镜头落在距离突然缩短的两张脸上，复杂系结动作可省略。</w:t>
+        <w:t>可以出门了。</w:t>
       </w:r>
     </w:p>
     <w:p>
@@ -2064,7 +2143,7 @@
         <w:rPr>
           <w:color w:val="926050"/>
         </w:rPr>
-        <w:t>【这张脸，近看还不收门票。】</w:t>
+        <w:t>【再不出门，司机该退休了。】</w:t>
       </w:r>
     </w:p>
     <w:p>
@@ -2072,7 +2151,15 @@
         <w:rPr>
           <w:color w:val="4D5860"/>
         </w:rPr>
-        <w:t>△ 他突然站得更直。她抬眼看他。</w:t>
+        <w:t>△ 他拿起车钥匙，她给他让路，眼睛却又在那条领带上多停了一瞬。</w:t>
+      </w:r>
+    </w:p>
+    <w:p>
+      <w:r>
+        <w:rPr>
+          <w:color w:val="4D5860"/>
+        </w:rPr>
+        <w:t>△ 女主手机震动，来电备注“妈妈”。她接起，笑容瞬间变标准。</w:t>
       </w:r>
     </w:p>
     <w:p>
@@ -2080,59 +2167,10 @@
         <w:rPr>
           <w:b/>
         </w:rPr>
-        <w:t>温书窈：</w:t>
-      </w:r>
-      <w:r>
-        <w:t>低一点。</w:t>
-      </w:r>
-    </w:p>
-    <w:p>
-      <w:r>
-        <w:rPr>
-          <w:color w:val="4D5860"/>
-        </w:rPr>
-        <w:t>△ 他立刻低头。她完成整理，笑容比刚才真实。</w:t>
-      </w:r>
-    </w:p>
-    <w:p>
-      <w:r>
-        <w:rPr>
-          <w:b/>
-        </w:rPr>
-        <w:t>温书窈：</w:t>
-      </w:r>
-      <w:r>
-        <w:t>好了。</w:t>
-      </w:r>
-    </w:p>
-    <w:p>
-      <w:r>
-        <w:rPr>
-          <w:color w:val="4D5860"/>
-        </w:rPr>
-        <w:t>△ 他看一眼镜子，又看向她。</w:t>
-      </w:r>
-    </w:p>
-    <w:p>
-      <w:r>
-        <w:rPr>
-          <w:b/>
-        </w:rPr>
-        <w:t>沈既白：</w:t>
-      </w:r>
-      <w:r>
-        <w:t>这次呢？</w:t>
-      </w:r>
-    </w:p>
-    <w:p>
-      <w:r>
-        <w:rPr>
-          <w:b/>
-        </w:rPr>
-        <w:t>温书窈：</w:t>
-      </w:r>
-      <w:r>
-        <w:t>可以出门了。</w:t>
+        <w:t>温母（电话音）：</w:t>
+      </w:r>
+      <w:r>
+        <w:t>我在楼下。</w:t>
       </w:r>
     </w:p>
     <w:p>
@@ -2147,7 +2185,7 @@
         <w:rPr>
           <w:color w:val="926050"/>
         </w:rPr>
-        <w:t>【再不出门，司机该退休了。】</w:t>
+        <w:t>【上级来巡店了。】</w:t>
       </w:r>
     </w:p>
     <w:p>
@@ -2155,7 +2193,50 @@
         <w:rPr>
           <w:color w:val="4D5860"/>
         </w:rPr>
-        <w:t>△ 他拿起车钥匙，她给他让路，眼睛却又在那条领带上多停了一瞬。</w:t>
+        <w:t>△ 她看向沙发上的零食和毯子。沈既白已经顺着她的眼神拿起零食袋。</w:t>
+      </w:r>
+    </w:p>
+    <w:p>
+      <w:r>
+        <w:t>剪辑点：女主伸手想抢，男主先一步藏到身后。</w:t>
+      </w:r>
+    </w:p>
+    <w:p>
+      <w:r>
+        <w:t>制作提示：母亲这次来访发生在同日午后；第四集承接前，女主为了收拾翻倒的饮料换上备用家居服，剧情中明确说明，不凭空换装。</w:t>
+      </w:r>
+    </w:p>
+    <w:p>
+      <w:pPr>
+        <w:pStyle w:val="Heading2"/>
+        <w:pageBreakBefore/>
+      </w:pPr>
+      <w:r>
+        <w:t>第4集《恐龙合法了》</w:t>
+      </w:r>
+    </w:p>
+    <w:p>
+      <w:pPr>
+        <w:keepNext/>
+      </w:pPr>
+      <w:r>
+        <w:t>本集目标：完整兑现“看穿她仍维护她”；把服装变化变成可理解的连续动作。</w:t>
+      </w:r>
+    </w:p>
+    <w:p>
+      <w:pPr>
+        <w:keepNext/>
+      </w:pPr>
+      <w:r>
+        <w:t>时间预算：0–10 秒穿错衣服迎来检查；10–38 秒男主接锅；38–65 秒母亲追问与女主配合；65–88 秒温柔落点及次日来客。</w:t>
+      </w:r>
+    </w:p>
+    <w:p>
+      <w:pPr>
+        <w:keepNext/>
+      </w:pPr>
+      <w:r>
+        <w:t>场景：承接第三集，沈宅·客厅。电梯到门口尚有片刻，女主刚处理了自己匆忙收拾时碰翻的奶茶。</w:t>
       </w:r>
     </w:p>
     <w:p>
@@ -2163,7 +2244,7 @@
         <w:rPr>
           <w:color w:val="4D5860"/>
         </w:rPr>
-        <w:t>△ 女主手机震动，来电备注“妈妈”。她接起，笑容瞬间变标准。</w:t>
+        <w:t>△ 她从相邻房间冲出来，身上是唯一随手拿到的绿色恐龙家居服，手里拎着洒湿的浅杏上衣。门铃响。</w:t>
       </w:r>
     </w:p>
     <w:p>
@@ -2171,10 +2252,29 @@
         <w:rPr>
           <w:b/>
         </w:rPr>
-        <w:t>温母（电话音）：</w:t>
-      </w:r>
-      <w:r>
-        <w:t>我在楼下。</w:t>
+        <w:t>温书窈：</w:t>
+      </w:r>
+      <w:r>
+        <w:t>怎么偏偏拿了这件……</w:t>
+      </w:r>
+    </w:p>
+    <w:p>
+      <w:r>
+        <w:rPr>
+          <w:color w:val="4D5860"/>
+        </w:rPr>
+        <w:t>△ 沈既白开门，温母的目光从女儿端正的站姿落到恐龙尾巴。</w:t>
+      </w:r>
+    </w:p>
+    <w:p>
+      <w:r>
+        <w:rPr>
+          <w:b/>
+        </w:rPr>
+        <w:t>温母：</w:t>
+      </w:r>
+      <w:r>
+        <w:t>书窈，你这是——</w:t>
       </w:r>
     </w:p>
     <w:p>
@@ -2189,7 +2289,18 @@
         <w:rPr>
           <w:color w:val="926050"/>
         </w:rPr>
-        <w:t>【上级来巡店了。】</w:t>
+        <w:t>【看脸，妈。今天先别往下看。】</w:t>
+      </w:r>
+    </w:p>
+    <w:p>
+      <w:r>
+        <w:rPr>
+          <w:b/>
+        </w:rPr>
+        <w:t>沈既白：</w:t>
+      </w:r>
+      <w:r>
+        <w:t>我选的。</w:t>
       </w:r>
     </w:p>
     <w:p>
@@ -2197,77 +2308,7 @@
         <w:rPr>
           <w:color w:val="4D5860"/>
         </w:rPr>
-        <w:t>△ 她看向沙发上的零食和毯子。沈既白已经顺着她的眼神拿起零食袋。</w:t>
-      </w:r>
-    </w:p>
-    <w:p>
-      <w:r>
-        <w:t>剪辑点：女主伸手想抢，男主先一步藏到身后。</w:t>
-      </w:r>
-    </w:p>
-    <w:p>
-      <w:r>
-        <w:t>制作提示：母亲这次来访发生在同日午后；第四集承接前，女主为了收拾翻倒的饮料换上备用家居服，剧情中明确说明，不凭空换装。</w:t>
-      </w:r>
-    </w:p>
-    <w:p>
-      <w:pPr>
-        <w:pStyle w:val="Heading2"/>
-        <w:pageBreakBefore/>
-      </w:pPr>
-      <w:r>
-        <w:t>第4集《恐龙合法了》</w:t>
-      </w:r>
-    </w:p>
-    <w:p>
-      <w:pPr>
-        <w:keepNext/>
-      </w:pPr>
-      <w:r>
-        <w:t>本集目标：完整兑现“看穿她仍维护她”；把服装变化变成可理解的连续动作。</w:t>
-      </w:r>
-    </w:p>
-    <w:p>
-      <w:pPr>
-        <w:keepNext/>
-      </w:pPr>
-      <w:r>
-        <w:t>时间预算：0–10 秒穿错衣服迎来检查；10–38 秒男主接锅；38–65 秒母亲追问与女主配合；65–88 秒温柔落点及次日来客。</w:t>
-      </w:r>
-    </w:p>
-    <w:p>
-      <w:pPr>
-        <w:keepNext/>
-      </w:pPr>
-      <w:r>
-        <w:t>场景：承接第三集，沈宅·客厅。电梯到门口尚有片刻，女主刚处理了自己匆忙收拾时碰翻的奶茶。</w:t>
-      </w:r>
-    </w:p>
-    <w:p>
-      <w:r>
-        <w:rPr>
-          <w:color w:val="4D5860"/>
-        </w:rPr>
-        <w:t>△ 她从相邻房间冲出来，身上是唯一随手拿到的绿色恐龙家居服，手里拎着洒湿的浅杏上衣。门铃响。</w:t>
-      </w:r>
-    </w:p>
-    <w:p>
-      <w:r>
-        <w:rPr>
-          <w:b/>
-        </w:rPr>
-        <w:t>温书窈：</w:t>
-      </w:r>
-      <w:r>
-        <w:t>怎么偏偏拿了这件……</w:t>
-      </w:r>
-    </w:p>
-    <w:p>
-      <w:r>
-        <w:rPr>
-          <w:color w:val="4D5860"/>
-        </w:rPr>
-        <w:t>△ 沈既白开门，温母的目光从女儿端正的站姿落到恐龙尾巴。</w:t>
+        <w:t>△ 女主看他。他面不改色，把藏在身后的零食也放到自己那侧。</w:t>
       </w:r>
     </w:p>
     <w:p>
@@ -2278,7 +2319,7 @@
         <w:t>温母：</w:t>
       </w:r>
       <w:r>
-        <w:t>书窈，你这是——</w:t>
+        <w:t>你喜欢这样的？</w:t>
       </w:r>
     </w:p>
     <w:p>
@@ -2293,7 +2334,7 @@
         <w:rPr>
           <w:color w:val="926050"/>
         </w:rPr>
-        <w:t>【看脸，妈。今天先别往下看。】</w:t>
+        <w:t>【别接！接了亲戚群都知道你养恐龙！】</w:t>
       </w:r>
     </w:p>
     <w:p>
@@ -2304,7 +2345,7 @@
         <w:t>沈既白：</w:t>
       </w:r>
       <w:r>
-        <w:t>我选的。</w:t>
+        <w:t>喜欢。</w:t>
       </w:r>
     </w:p>
     <w:p>
@@ -2312,7 +2353,7 @@
         <w:rPr>
           <w:color w:val="4D5860"/>
         </w:rPr>
-        <w:t>△ 女主看他。他面不改色，把藏在身后的零食也放到自己那侧。</w:t>
+        <w:t>△ 她怔住。母亲的训话短暂停工，只好整理了一下包带。</w:t>
       </w:r>
     </w:p>
     <w:p>
@@ -2323,7 +2364,37 @@
         <w:t>温母：</w:t>
       </w:r>
       <w:r>
-        <w:t>你喜欢这样的？</w:t>
+        <w:t>那也不能整天——</w:t>
+      </w:r>
+    </w:p>
+    <w:p>
+      <w:r>
+        <w:rPr>
+          <w:b/>
+        </w:rPr>
+        <w:t>温书窈：</w:t>
+      </w:r>
+      <w:r>
+        <w:t>妈，奶茶洒了，刚换的。您坐，我去换回来。</w:t>
+      </w:r>
+    </w:p>
+    <w:p>
+      <w:r>
+        <w:rPr>
+          <w:color w:val="4D5860"/>
+        </w:rPr>
+        <w:t>△ 她迈步，尾巴被自己踩住，小幅踉跄。他扶稳她的手肘，松开后自然把毯子递过去。</w:t>
+      </w:r>
+    </w:p>
+    <w:p>
+      <w:r>
+        <w:rPr>
+          <w:b/>
+        </w:rPr>
+        <w:t>沈既白：</w:t>
+      </w:r>
+      <w:r>
+        <w:t>先坐。湿衣服晾着。</w:t>
       </w:r>
     </w:p>
     <w:p>
@@ -2338,18 +2409,7 @@
         <w:rPr>
           <w:color w:val="926050"/>
         </w:rPr>
-        <w:t>【别接！接了亲戚群都知道你养恐龙！】</w:t>
-      </w:r>
-    </w:p>
-    <w:p>
-      <w:r>
-        <w:rPr>
-          <w:b/>
-        </w:rPr>
-        <w:t>沈既白：</w:t>
-      </w:r>
-      <w:r>
-        <w:t>喜欢。</w:t>
+        <w:t>【他连尾巴都接住了。】</w:t>
       </w:r>
     </w:p>
     <w:p>
@@ -2357,7 +2417,7 @@
         <w:rPr>
           <w:color w:val="4D5860"/>
         </w:rPr>
-        <w:t>△ 她怔住。母亲的训话短暂停工，只好整理了一下包带。</w:t>
+        <w:t>△ 母亲坐下，看到女儿把毯子搭在膝头，表情稍缓。</w:t>
       </w:r>
     </w:p>
     <w:p>
@@ -2368,18 +2428,7 @@
         <w:t>温母：</w:t>
       </w:r>
       <w:r>
-        <w:t>那也不能整天——</w:t>
-      </w:r>
-    </w:p>
-    <w:p>
-      <w:r>
-        <w:rPr>
-          <w:b/>
-        </w:rPr>
-        <w:t>温书窈：</w:t>
-      </w:r>
-      <w:r>
-        <w:t>妈，奶茶洒了，刚换的。您坐，我去换回来。</w:t>
+        <w:t>明天下午楚楚过来。正好聊聊你们店的事。</w:t>
       </w:r>
     </w:p>
     <w:p>
@@ -2387,18 +2436,7 @@
         <w:rPr>
           <w:color w:val="4D5860"/>
         </w:rPr>
-        <w:t>△ 她迈步，尾巴被自己踩住，小幅踉跄。他扶稳她的手肘，松开后自然把毯子递过去。</w:t>
-      </w:r>
-    </w:p>
-    <w:p>
-      <w:r>
-        <w:rPr>
-          <w:b/>
-        </w:rPr>
-        <w:t>沈既白：</w:t>
-      </w:r>
-      <w:r>
-        <w:t>先坐。湿衣服晾着。</w:t>
+        <w:t>△ 温书窈刚放松的背又直了。</w:t>
       </w:r>
     </w:p>
     <w:p>
@@ -2413,7 +2451,50 @@
         <w:rPr>
           <w:color w:val="926050"/>
         </w:rPr>
-        <w:t>【他连尾巴都接住了。】</w:t>
+        <w:t>【售后服务明天还来一位。】</w:t>
+      </w:r>
+    </w:p>
+    <w:p>
+      <w:r>
+        <w:t>剪辑点：沈既白看见她坐直，悄悄把她喜欢的零食往毯子下推近一点。</w:t>
+      </w:r>
+    </w:p>
+    <w:p>
+      <w:r>
+        <w:t>制作提示：恐龙尾巴与搀扶是唯一动作笑点，拆成脚部插入、上半身反应两镜，避免生成长段复杂肢体接触。</w:t>
+      </w:r>
+    </w:p>
+    <w:p>
+      <w:pPr>
+        <w:pStyle w:val="Heading2"/>
+        <w:pageBreakBefore/>
+      </w:pPr>
+      <w:r>
+        <w:t>第5集《请开始你的加班》</w:t>
+      </w:r>
+    </w:p>
+    <w:p>
+      <w:pPr>
+        <w:keepNext/>
+      </w:pPr>
+      <w:r>
+        <w:t>本集目标：女主自己反击，男主顺势配合。前半段有轻微压力，本集内必须完成回敬。</w:t>
+      </w:r>
+    </w:p>
+    <w:p>
+      <w:pPr>
+        <w:keepNext/>
+      </w:pPr>
+      <w:r>
+        <w:t>时间预算：0–15 秒客气地派活；15–40 秒女主用对方的话反转；40–65 秒男主加入；65–88 秒两人的暗中默契。</w:t>
+      </w:r>
+    </w:p>
+    <w:p>
+      <w:pPr>
+        <w:keepNext/>
+      </w:pPr>
+      <w:r>
+        <w:t>场景：次日下午，沈宅·客厅茶桌。温母与林楚楚来访。茶具只保留壶、杯、茶托，不拍复杂茶道。</w:t>
       </w:r>
     </w:p>
     <w:p>
@@ -2421,7 +2502,7 @@
         <w:rPr>
           <w:color w:val="4D5860"/>
         </w:rPr>
-        <w:t>△ 母亲坐下，看到女儿把毯子搭在膝头，表情稍缓。</w:t>
+        <w:t>△ 林楚楚刚放下礼物，就把茶壶往温书窈面前推。</w:t>
       </w:r>
     </w:p>
     <w:p>
@@ -2429,18 +2510,21 @@
         <w:rPr>
           <w:b/>
         </w:rPr>
-        <w:t>温母：</w:t>
-      </w:r>
-      <w:r>
-        <w:t>明天下午楚楚过来。正好聊聊你们店的事。</w:t>
+        <w:t>林楚楚：</w:t>
+      </w:r>
+      <w:r>
+        <w:t>书窈泡茶最有规矩。嫁进来，总得让沈总见识见识。</w:t>
       </w:r>
     </w:p>
     <w:p>
       <w:r>
         <w:rPr>
-          <w:color w:val="4D5860"/>
+          <w:b/>
         </w:rPr>
-        <w:t>△ 温书窈刚放松的背又直了。</w:t>
+        <w:t>温书窈：</w:t>
+      </w:r>
+      <w:r>
+        <w:t>当然。</w:t>
       </w:r>
     </w:p>
     <w:p>
@@ -2455,50 +2539,7 @@
         <w:rPr>
           <w:color w:val="926050"/>
         </w:rPr>
-        <w:t>【售后服务明天还来一位。】</w:t>
-      </w:r>
-    </w:p>
-    <w:p>
-      <w:r>
-        <w:t>剪辑点：沈既白看见她坐直，悄悄把她喜欢的零食往毯子下推近一点。</w:t>
-      </w:r>
-    </w:p>
-    <w:p>
-      <w:r>
-        <w:t>制作提示：恐龙尾巴与搀扶是唯一动作笑点，拆成脚部插入、上半身反应两镜，避免生成长段复杂肢体接触。</w:t>
-      </w:r>
-    </w:p>
-    <w:p>
-      <w:pPr>
-        <w:pStyle w:val="Heading2"/>
-        <w:pageBreakBefore/>
-      </w:pPr>
-      <w:r>
-        <w:t>第5集《请开始你的加班》</w:t>
-      </w:r>
-    </w:p>
-    <w:p>
-      <w:pPr>
-        <w:keepNext/>
-      </w:pPr>
-      <w:r>
-        <w:t>本集目标：女主自己反击，男主顺势配合。前半段有轻微压力，本集内必须完成回敬。</w:t>
-      </w:r>
-    </w:p>
-    <w:p>
-      <w:pPr>
-        <w:keepNext/>
-      </w:pPr>
-      <w:r>
-        <w:t>时间预算：0–15 秒客气地派活；15–40 秒女主用对方的话反转；40–65 秒男主加入；65–88 秒两人的暗中默契。</w:t>
-      </w:r>
-    </w:p>
-    <w:p>
-      <w:pPr>
-        <w:keepNext/>
-      </w:pPr>
-      <w:r>
-        <w:t>场景：次日下午，沈宅·客厅茶桌。温母与林楚楚来访。茶具只保留壶、杯、茶托，不拍复杂茶道。</w:t>
+        <w:t>【随礼两盒饼干，附赠我两小时劳务。】</w:t>
       </w:r>
     </w:p>
     <w:p>
@@ -2506,7 +2547,18 @@
         <w:rPr>
           <w:color w:val="4D5860"/>
         </w:rPr>
-        <w:t>△ 林楚楚刚放下礼物，就把茶壶往温书窈面前推。</w:t>
+        <w:t>△ 沈既白正要伸手，温书窈先拿起一只空茶托。</w:t>
+      </w:r>
+    </w:p>
+    <w:p>
+      <w:r>
+        <w:rPr>
+          <w:b/>
+        </w:rPr>
+        <w:t>温书窈：</w:t>
+      </w:r>
+      <w:r>
+        <w:t>楚楚刚学完茶艺，我正想请教。今天您主泡，我给您递杯？</w:t>
       </w:r>
     </w:p>
     <w:p>
@@ -2517,7 +2569,7 @@
         <w:t>林楚楚：</w:t>
       </w:r>
       <w:r>
-        <w:t>书窈泡茶最有规矩。嫁进来，总得让沈总见识见识。</w:t>
+        <w:t>我就是随口——</w:t>
       </w:r>
     </w:p>
     <w:p>
@@ -2528,7 +2580,7 @@
         <w:t>温书窈：</w:t>
       </w:r>
       <w:r>
-        <w:t>当然。</w:t>
+        <w:t>你刚说的呀，一家人，别见外。</w:t>
       </w:r>
     </w:p>
     <w:p>
@@ -2543,7 +2595,7 @@
         <w:rPr>
           <w:color w:val="926050"/>
         </w:rPr>
-        <w:t>【随礼两盒饼干，附赠我两小时劳务。】</w:t>
+        <w:t>【来，茶艺大师，请开始你的加班。】</w:t>
       </w:r>
     </w:p>
     <w:p>
@@ -2551,7 +2603,37 @@
         <w:rPr>
           <w:color w:val="4D5860"/>
         </w:rPr>
-        <w:t>△ 沈既白正要伸手，温书窈先拿起一只空茶托。</w:t>
+        <w:t>△ 沈既白听不见心声，但看见文字，顺势把小茶壶稳稳放到林楚楚手边。</w:t>
+      </w:r>
+    </w:p>
+    <w:p>
+      <w:r>
+        <w:rPr>
+          <w:b/>
+        </w:rPr>
+        <w:t>沈既白：</w:t>
+      </w:r>
+      <w:r>
+        <w:t>辛苦。</w:t>
+      </w:r>
+    </w:p>
+    <w:p>
+      <w:r>
+        <w:rPr>
+          <w:color w:val="4D5860"/>
+        </w:rPr>
+        <w:t>△ 温母也好奇地望过去。林楚楚只得接壶。</w:t>
+      </w:r>
+    </w:p>
+    <w:p>
+      <w:r>
+        <w:rPr>
+          <w:b/>
+        </w:rPr>
+        <w:t>林楚楚：</w:t>
+      </w:r>
+      <w:r>
+        <w:t>其实水温得先——</w:t>
       </w:r>
     </w:p>
     <w:p>
@@ -2562,29 +2644,15 @@
         <w:t>温书窈：</w:t>
       </w:r>
       <w:r>
-        <w:t>楚楚刚学完茶艺，我正想请教。今天您主泡，我给您递杯？</w:t>
+        <w:t>您慢慢讲，我们学。</w:t>
       </w:r>
     </w:p>
     <w:p>
       <w:r>
         <w:rPr>
-          <w:b/>
+          <w:color w:val="4D5860"/>
         </w:rPr>
-        <w:t>林楚楚：</w:t>
-      </w:r>
-      <w:r>
-        <w:t>我就是随口——</w:t>
-      </w:r>
-    </w:p>
-    <w:p>
-      <w:r>
-        <w:rPr>
-          <w:b/>
-        </w:rPr>
-        <w:t>温书窈：</w:t>
-      </w:r>
-      <w:r>
-        <w:t>你刚说的呀，一家人，别见外。</w:t>
+        <w:t>△ 她坐回沈既白旁边，终于能拿起一块饼干。两人碰了一下眼神，又各自认真看向茶桌。</w:t>
       </w:r>
     </w:p>
     <w:p>
@@ -2599,7 +2667,7 @@
         <w:rPr>
           <w:color w:val="926050"/>
         </w:rPr>
-        <w:t>【来，茶艺大师，请开始你的加班。】</w:t>
+        <w:t>【配合不错。给你加个鸡腿。】</w:t>
       </w:r>
     </w:p>
     <w:p>
@@ -2607,7 +2675,18 @@
         <w:rPr>
           <w:color w:val="4D5860"/>
         </w:rPr>
-        <w:t>△ 沈既白听不见心声，但看见文字，顺势把小茶壶稳稳放到林楚楚手边。</w:t>
+        <w:t>△ 他忍住笑，伸手替她扶正歪掉的靠垫。袖口的松扣挂住垫边，轻轻崩落。</w:t>
+      </w:r>
+    </w:p>
+    <w:p>
+      <w:r>
+        <w:rPr>
+          <w:b/>
+        </w:rPr>
+        <w:t>温书窈：</w:t>
+      </w:r>
+      <w:r>
+        <w:t>你的扣子。</w:t>
       </w:r>
     </w:p>
     <w:p>
@@ -2618,7 +2697,7 @@
         <w:t>沈既白：</w:t>
       </w:r>
       <w:r>
-        <w:t>辛苦。</w:t>
+        <w:t>没事。</w:t>
       </w:r>
     </w:p>
     <w:p>
@@ -2626,18 +2705,58 @@
         <w:rPr>
           <w:color w:val="4D5860"/>
         </w:rPr>
-        <w:t>△ 温母也好奇地望过去。林楚楚只得接壶。</w:t>
+        <w:t>△ 她比他更快拾起，收进自己掌心。</w:t>
+      </w:r>
+    </w:p>
+    <w:p>
+      <w:r>
+        <w:t>剪辑点：他朝她伸手要，她合起手，向他眨了一下眼。</w:t>
+      </w:r>
+    </w:p>
+    <w:p>
+      <w:r>
+        <w:t>制作提示：不要把林楚楚演成全无能力。她可以真的会泡茶，喜剧来自她只想派活却被请到劳动席。女主只夺回休息权。</w:t>
+      </w:r>
+    </w:p>
+    <w:p>
+      <w:pPr>
+        <w:pStyle w:val="Heading2"/>
+        <w:pageBreakBefore/>
+      </w:pPr>
+      <w:r>
+        <w:t>第6集《你也可以不会》</w:t>
+      </w:r>
+    </w:p>
+    <w:p>
+      <w:pPr>
+        <w:keepNext/>
+      </w:pPr>
+      <w:r>
+        <w:t>本集目标：把“被理解”写成双向。女主的实际手艺在小事中出现，为后续产品方案做铺垫。</w:t>
+      </w:r>
+    </w:p>
+    <w:p>
+      <w:pPr>
+        <w:keepNext/>
+      </w:pPr>
+      <w:r>
+        <w:t>时间预算：0–18 秒发现他试图自己修；18–42 秒女主接手；42–70 秒互相留台阶；70–87 秒礼物与闺蜜来访。</w:t>
+      </w:r>
+    </w:p>
+    <w:p>
+      <w:pPr>
+        <w:keepNext/>
+      </w:pPr>
+      <w:r>
+        <w:t>场景：第五集当晚，沈宅·书房。客人已走。男主换了家居衬衫，坏了扣子的外套放在桌边。</w:t>
       </w:r>
     </w:p>
     <w:p>
       <w:r>
         <w:rPr>
-          <w:b/>
+          <w:color w:val="4D5860"/>
         </w:rPr>
-        <w:t>林楚楚：</w:t>
-      </w:r>
-      <w:r>
-        <w:t>其实水温得先——</w:t>
+        <w:t>△ 沈既白对照手机上的教程，拿着那枚被她放回桌上的扣子，线头迟迟没穿过去。温书窈敲了敲敞开的门。</w:t>
       </w:r>
     </w:p>
     <w:p>
@@ -2648,15 +2767,18 @@
         <w:t>温书窈：</w:t>
       </w:r>
       <w:r>
-        <w:t>您慢慢讲，我们学。</w:t>
+        <w:t>沈先生亲自处理售后？</w:t>
       </w:r>
     </w:p>
     <w:p>
       <w:r>
         <w:rPr>
-          <w:color w:val="4D5860"/>
+          <w:b/>
         </w:rPr>
-        <w:t>△ 她坐回沈既白旁边，终于能拿起一块饼干。两人碰了一下眼神，又各自认真看向茶桌。</w:t>
+        <w:t>沈既白：</w:t>
+      </w:r>
+      <w:r>
+        <w:t>很简单。</w:t>
       </w:r>
     </w:p>
     <w:p>
@@ -2671,7 +2793,7 @@
         <w:rPr>
           <w:color w:val="926050"/>
         </w:rPr>
-        <w:t>【配合不错。给你加个鸡腿。】</w:t>
+        <w:t>【教程三分钟，您穿线二十分钟。】</w:t>
       </w:r>
     </w:p>
     <w:p>
@@ -2679,7 +2801,7 @@
         <w:rPr>
           <w:color w:val="4D5860"/>
         </w:rPr>
-        <w:t>△ 他忍住笑，伸手替她扶正歪掉的靠垫。袖口的松扣挂住垫边，轻轻崩落。</w:t>
+        <w:t>△ 他看见字，终于放下针线。她从掌心拿出穿线器。</w:t>
       </w:r>
     </w:p>
     <w:p>
@@ -2690,7 +2812,15 @@
         <w:t>温书窈：</w:t>
       </w:r>
       <w:r>
-        <w:t>你的扣子。</w:t>
+        <w:t>这个比较快。</w:t>
+      </w:r>
+    </w:p>
+    <w:p>
+      <w:r>
+        <w:rPr>
+          <w:color w:val="4D5860"/>
+        </w:rPr>
+        <w:t>△ 她坐到桌边接过外套。只拍一两个动作插入，再切男主观察她专注的表情。</w:t>
       </w:r>
     </w:p>
     <w:p>
@@ -2701,66 +2831,7 @@
         <w:t>沈既白：</w:t>
       </w:r>
       <w:r>
-        <w:t>没事。</w:t>
-      </w:r>
-    </w:p>
-    <w:p>
-      <w:r>
-        <w:rPr>
-          <w:color w:val="4D5860"/>
-        </w:rPr>
-        <w:t>△ 她比他更快拾起，收进自己掌心。</w:t>
-      </w:r>
-    </w:p>
-    <w:p>
-      <w:r>
-        <w:t>剪辑点：他朝她伸手要，她合起手，向他眨了一下眼。</w:t>
-      </w:r>
-    </w:p>
-    <w:p>
-      <w:r>
-        <w:t>制作提示：不要把林楚楚演成全无能力。她可以真的会泡茶，喜剧来自她只想派活却被请到劳动席。女主只夺回休息权。</w:t>
-      </w:r>
-    </w:p>
-    <w:p>
-      <w:pPr>
-        <w:pStyle w:val="Heading2"/>
-        <w:pageBreakBefore/>
-      </w:pPr>
-      <w:r>
-        <w:t>第6集《你也可以不会》</w:t>
-      </w:r>
-    </w:p>
-    <w:p>
-      <w:pPr>
-        <w:keepNext/>
-      </w:pPr>
-      <w:r>
-        <w:t>本集目标：把“被理解”写成双向。女主的实际手艺在小事中出现，为后续产品方案做铺垫。</w:t>
-      </w:r>
-    </w:p>
-    <w:p>
-      <w:pPr>
-        <w:keepNext/>
-      </w:pPr>
-      <w:r>
-        <w:t>时间预算：0–18 秒发现他试图自己修；18–42 秒女主接手；42–70 秒互相留台阶；70–87 秒礼物与闺蜜来访。</w:t>
-      </w:r>
-    </w:p>
-    <w:p>
-      <w:pPr>
-        <w:keepNext/>
-      </w:pPr>
-      <w:r>
-        <w:t>场景：第五集当晚，沈宅·书房。客人已走。男主换了家居衬衫，坏了扣子的外套放在桌边。</w:t>
-      </w:r>
-    </w:p>
-    <w:p>
-      <w:r>
-        <w:rPr>
-          <w:color w:val="4D5860"/>
-        </w:rPr>
-        <w:t>△ 沈既白对照手机上的教程，拿着那枚被她放回桌上的扣子，线头迟迟没穿过去。温书窈敲了敲敞开的门。</w:t>
+        <w:t>你会这个？</w:t>
       </w:r>
     </w:p>
     <w:p>
@@ -2771,18 +2842,15 @@
         <w:t>温书窈：</w:t>
       </w:r>
       <w:r>
-        <w:t>沈先生亲自处理售后？</w:t>
+        <w:t>我家卖布的。总不能只会夸布好看。</w:t>
       </w:r>
     </w:p>
     <w:p>
       <w:r>
         <w:rPr>
-          <w:b/>
+          <w:color w:val="4D5860"/>
         </w:rPr>
-        <w:t>沈既白：</w:t>
-      </w:r>
-      <w:r>
-        <w:t>很简单。</w:t>
+        <w:t>△ 他笑了。她抬头，第一次看清他没有防备的笑。</w:t>
       </w:r>
     </w:p>
     <w:p>
@@ -2797,7 +2865,7 @@
         <w:rPr>
           <w:color w:val="926050"/>
         </w:rPr>
-        <w:t>【教程三分钟，您穿线二十分钟。】</w:t>
+        <w:t>【原来会笑。早这样，多省宣传费。】</w:t>
       </w:r>
     </w:p>
     <w:p>
@@ -2805,7 +2873,7 @@
         <w:rPr>
           <w:color w:val="4D5860"/>
         </w:rPr>
-        <w:t>△ 他看见字，终于放下针线。她从掌心拿出穿线器。</w:t>
+        <w:t>△ 他立刻想收回笑。她把修好的袖口递给他。</w:t>
       </w:r>
     </w:p>
     <w:p>
@@ -2816,7 +2884,7 @@
         <w:t>温书窈：</w:t>
       </w:r>
       <w:r>
-        <w:t>这个比较快。</w:t>
+        <w:t>不用什么都会。你不会的，我有几样刚好会。</w:t>
       </w:r>
     </w:p>
     <w:p>
@@ -2824,7 +2892,26 @@
         <w:rPr>
           <w:color w:val="4D5860"/>
         </w:rPr>
-        <w:t>△ 她坐到桌边接过外套。只拍一两个动作插入，再切男主观察她专注的表情。</w:t>
+        <w:t>△ 他看着袖口，点头。桌上还有一小盒她带来的点心。</w:t>
+      </w:r>
+    </w:p>
+    <w:p>
+      <w:r>
+        <w:rPr>
+          <w:b/>
+        </w:rPr>
+        <w:t>温书窈：</w:t>
+      </w:r>
+      <w:r>
+        <w:t>不辣的。这回不用替我试毒。</w:t>
+      </w:r>
+    </w:p>
+    <w:p>
+      <w:r>
+        <w:rPr>
+          <w:color w:val="4D5860"/>
+        </w:rPr>
+        <w:t>△ 他看她。她已经把针线收好，假装没发现他的窘迫。</w:t>
       </w:r>
     </w:p>
     <w:p>
@@ -2835,26 +2922,7 @@
         <w:t>沈既白：</w:t>
       </w:r>
       <w:r>
-        <w:t>你会这个？</w:t>
-      </w:r>
-    </w:p>
-    <w:p>
-      <w:r>
-        <w:rPr>
-          <w:b/>
-        </w:rPr>
-        <w:t>温书窈：</w:t>
-      </w:r>
-      <w:r>
-        <w:t>我家卖布的。总不能只会夸布好看。</w:t>
-      </w:r>
-    </w:p>
-    <w:p>
-      <w:r>
-        <w:rPr>
-          <w:color w:val="4D5860"/>
-        </w:rPr>
-        <w:t>△ 他笑了。她抬头，第一次看清他没有防备的笑。</w:t>
+        <w:t>谢谢，温老师。</w:t>
       </w:r>
     </w:p>
     <w:p>
@@ -2869,7 +2937,7 @@
         <w:rPr>
           <w:color w:val="926050"/>
         </w:rPr>
-        <w:t>【原来会笑。早这样，多省宣传费。】</w:t>
+        <w:t>【完了。他还挺会交学费。】</w:t>
       </w:r>
     </w:p>
     <w:p>
@@ -2877,7 +2945,88 @@
         <w:rPr>
           <w:color w:val="4D5860"/>
         </w:rPr>
-        <w:t>△ 他立刻想收回笑。她把修好的袖口递给他。</w:t>
+        <w:t>△ 她手机亮，苏蔓发来短语音。</w:t>
+      </w:r>
+    </w:p>
+    <w:p>
+      <w:r>
+        <w:rPr>
+          <w:b/>
+        </w:rPr>
+        <w:t>苏蔓（语音）：</w:t>
+      </w:r>
+      <w:r>
+        <w:t>明天来看你！放心，你那些事我一句不说！</w:t>
+      </w:r>
+    </w:p>
+    <w:p>
+      <w:r>
+        <w:rPr>
+          <w:color w:val="4D5860"/>
+        </w:rPr>
+        <w:t>△ 温书窈按停语音，慢慢闭眼。沈既白抬起头。</w:t>
+      </w:r>
+    </w:p>
+    <w:p>
+      <w:r>
+        <w:t>剪辑点：他明显想问，她已经用营业笑把话题封住。</w:t>
+      </w:r>
+    </w:p>
+    <w:p>
+      <w:r>
+        <w:t>制作提示：缝扣子用实拍素材或简洁特写补足，不要求 AI 连续生成完整针线操作。针线由女主明确收好。</w:t>
+      </w:r>
+    </w:p>
+    <w:p>
+      <w:pPr>
+        <w:pStyle w:val="Heading2"/>
+        <w:pageBreakBefore/>
+      </w:pPr>
+      <w:r>
+        <w:t>第7集《黑历史售后》</w:t>
+      </w:r>
+    </w:p>
+    <w:p>
+      <w:pPr>
+        <w:keepNext/>
+      </w:pPr>
+      <w:r>
+        <w:t>本集目标：让两人共享一次笑话；男主主动提供自己的不完美，避免女主一直是被围观的一方。</w:t>
+      </w:r>
+    </w:p>
+    <w:p>
+      <w:pPr>
+        <w:keepNext/>
+      </w:pPr>
+      <w:r>
+        <w:t>时间预算：0–18 秒闺蜜漏底；18–45 秒男主反应与自曝；45–68 秒女主放下防备；68–88 秒事业问题出现。</w:t>
+      </w:r>
+    </w:p>
+    <w:p>
+      <w:pPr>
+        <w:keepNext/>
+      </w:pPr>
+      <w:r>
+        <w:t>场景：次日下午，沈宅·客厅。苏蔓只带两杯饮料和一袋点心，避免复杂道具。</w:t>
+      </w:r>
+    </w:p>
+    <w:p>
+      <w:r>
+        <w:rPr>
+          <w:b/>
+        </w:rPr>
+        <w:t>苏蔓：</w:t>
+      </w:r>
+      <w:r>
+        <w:t>我来之前特意练了，大学的事一句不——</w:t>
+      </w:r>
+    </w:p>
+    <w:p>
+      <w:r>
+        <w:rPr>
+          <w:color w:val="4D5860"/>
+        </w:rPr>
+        <w:t>△ 她看见沈既白，立刻坐直。温书窈递给她一杯水。</w:t>
       </w:r>
     </w:p>
     <w:p>
@@ -2888,15 +3037,7 @@
         <w:t>温书窈：</w:t>
       </w:r>
       <w:r>
-        <w:t>不用什么都会。你不会的，我有几样刚好会。</w:t>
-      </w:r>
-    </w:p>
-    <w:p>
-      <w:r>
-        <w:rPr>
-          <w:color w:val="4D5860"/>
-        </w:rPr>
-        <w:t>△ 他看着袖口，点头。桌上还有一小盒她带来的点心。</w:t>
+        <w:t>喝水。</w:t>
       </w:r>
     </w:p>
     <w:p>
@@ -2904,29 +3045,10 @@
         <w:rPr>
           <w:b/>
         </w:rPr>
-        <w:t>温书窈：</w:t>
-      </w:r>
-      <w:r>
-        <w:t>不辣的。这回不用替我试毒。</w:t>
-      </w:r>
-    </w:p>
-    <w:p>
-      <w:r>
-        <w:rPr>
-          <w:color w:val="4D5860"/>
-        </w:rPr>
-        <w:t>△ 他看她。她已经把针线收好，假装没发现他的窘迫。</w:t>
-      </w:r>
-    </w:p>
-    <w:p>
-      <w:r>
-        <w:rPr>
-          <w:b/>
-        </w:rPr>
-        <w:t>沈既白：</w:t>
-      </w:r>
-      <w:r>
-        <w:t>谢谢，温老师。</w:t>
+        <w:t>苏蔓：</w:t>
+      </w:r>
+      <w:r>
+        <w:t>尤其你把给校草的情书发进班级群那次——</w:t>
       </w:r>
     </w:p>
     <w:p>
@@ -2941,7 +3063,7 @@
         <w:rPr>
           <w:color w:val="926050"/>
         </w:rPr>
-        <w:t>【完了。他还挺会交学费。】</w:t>
+        <w:t>【水为什么堵不住她的嘴。】</w:t>
       </w:r>
     </w:p>
     <w:p>
@@ -2949,7 +3071,7 @@
         <w:rPr>
           <w:color w:val="4D5860"/>
         </w:rPr>
-        <w:t>△ 她手机亮，苏蔓发来短语音。</w:t>
+        <w:t>△ 沈既白先看向女主，见她耳根发热，收住了已经出来的笑意。</w:t>
       </w:r>
     </w:p>
     <w:p>
@@ -2957,61 +3079,21 @@
         <w:rPr>
           <w:b/>
         </w:rPr>
-        <w:t>苏蔓（语音）：</w:t>
-      </w:r>
-      <w:r>
-        <w:t>明天来看你！放心，你那些事我一句不说！</w:t>
+        <w:t>沈既白：</w:t>
+      </w:r>
+      <w:r>
+        <w:t>后来呢？</w:t>
       </w:r>
     </w:p>
     <w:p>
       <w:r>
         <w:rPr>
-          <w:color w:val="4D5860"/>
+          <w:b/>
         </w:rPr>
-        <w:t>△ 温书窈按停语音，慢慢闭眼。沈既白抬起头。</w:t>
-      </w:r>
-    </w:p>
-    <w:p>
-      <w:r>
-        <w:t>剪辑点：他明显想问，她已经用营业笑把话题封住。</w:t>
-      </w:r>
-    </w:p>
-    <w:p>
-      <w:r>
-        <w:t>制作提示：缝扣子用实拍素材或简洁特写补足，不要求 AI 连续生成完整针线操作。针线由女主明确收好。</w:t>
-      </w:r>
-    </w:p>
-    <w:p>
-      <w:pPr>
-        <w:pStyle w:val="Heading2"/>
-        <w:pageBreakBefore/>
-      </w:pPr>
-      <w:r>
-        <w:t>第7集《黑历史售后》</w:t>
-      </w:r>
-    </w:p>
-    <w:p>
-      <w:pPr>
-        <w:keepNext/>
-      </w:pPr>
-      <w:r>
-        <w:t>本集目标：让两人共享一次笑话；男主主动提供自己的不完美，避免女主一直是被围观的一方。</w:t>
-      </w:r>
-    </w:p>
-    <w:p>
-      <w:pPr>
-        <w:keepNext/>
-      </w:pPr>
-      <w:r>
-        <w:t>时间预算：0–18 秒闺蜜漏底；18–45 秒男主反应与自曝；45–68 秒女主放下防备；68–88 秒事业问题出现。</w:t>
-      </w:r>
-    </w:p>
-    <w:p>
-      <w:pPr>
-        <w:keepNext/>
-      </w:pPr>
-      <w:r>
-        <w:t>场景：次日下午，沈宅·客厅。苏蔓只带两杯饮料和一袋点心，避免复杂道具。</w:t>
+        <w:t>温书窈：</w:t>
+      </w:r>
+      <w:r>
+        <w:t>撤回了。</w:t>
       </w:r>
     </w:p>
     <w:p>
@@ -3022,7 +3104,7 @@
         <w:t>苏蔓：</w:t>
       </w:r>
       <w:r>
-        <w:t>我来之前特意练了，大学的事一句不——</w:t>
+        <w:t>她说那是反诈演练。</w:t>
       </w:r>
     </w:p>
     <w:p>
@@ -3030,7 +3112,37 @@
         <w:rPr>
           <w:color w:val="4D5860"/>
         </w:rPr>
-        <w:t>△ 她看见沈既白，立刻坐直。温书窈递给她一杯水。</w:t>
+        <w:t>△ 半秒安静。温书窈维持住微笑，沈既白放下水杯。</w:t>
+      </w:r>
+    </w:p>
+    <w:p>
+      <w:r>
+        <w:rPr>
+          <w:b/>
+        </w:rPr>
+        <w:t>沈既白：</w:t>
+      </w:r>
+      <w:r>
+        <w:t>我把辞职信发给过董事长。</w:t>
+      </w:r>
+    </w:p>
+    <w:p>
+      <w:r>
+        <w:rPr>
+          <w:color w:val="4D5860"/>
+        </w:rPr>
+        <w:t>△ 两个女孩同时看向他。</w:t>
+      </w:r>
+    </w:p>
+    <w:p>
+      <w:r>
+        <w:rPr>
+          <w:b/>
+        </w:rPr>
+        <w:t>沈既白：</w:t>
+      </w:r>
+      <w:r>
+        <w:t>演练稿。忘了删收件人。</w:t>
       </w:r>
     </w:p>
     <w:p>
@@ -3041,7 +3153,7 @@
         <w:t>温书窈：</w:t>
       </w:r>
       <w:r>
-        <w:t>喝水。</w:t>
+        <w:t>后来呢？</w:t>
       </w:r>
     </w:p>
     <w:p>
@@ -3049,10 +3161,18 @@
         <w:rPr>
           <w:b/>
         </w:rPr>
-        <w:t>苏蔓：</w:t>
-      </w:r>
-      <w:r>
-        <w:t>尤其你把给校草的情书发进班级群那次——</w:t>
+        <w:t>沈既白：</w:t>
+      </w:r>
+      <w:r>
+        <w:t>他回我，批准。第二天我照常上班。</w:t>
+      </w:r>
+    </w:p>
+    <w:p>
+      <w:r>
+        <w:rPr>
+          <w:color w:val="4D5860"/>
+        </w:rPr>
+        <w:t>△ 女主没忍住笑出声，接着看见他也在笑。</w:t>
       </w:r>
     </w:p>
     <w:p>
@@ -3067,7 +3187,7 @@
         <w:rPr>
           <w:color w:val="926050"/>
         </w:rPr>
-        <w:t>【水为什么堵不住她的嘴。】</w:t>
+        <w:t>【原来总裁也有撤回不了的人生。】</w:t>
       </w:r>
     </w:p>
     <w:p>
@@ -3075,29 +3195,7 @@
         <w:rPr>
           <w:color w:val="4D5860"/>
         </w:rPr>
-        <w:t>△ 沈既白先看向女主，见她耳根发热，收住了已经出来的笑意。</w:t>
-      </w:r>
-    </w:p>
-    <w:p>
-      <w:r>
-        <w:rPr>
-          <w:b/>
-        </w:rPr>
-        <w:t>沈既白：</w:t>
-      </w:r>
-      <w:r>
-        <w:t>后来呢？</w:t>
-      </w:r>
-    </w:p>
-    <w:p>
-      <w:r>
-        <w:rPr>
-          <w:b/>
-        </w:rPr>
-        <w:t>温书窈：</w:t>
-      </w:r>
-      <w:r>
-        <w:t>撤回了。</w:t>
+        <w:t>△ 苏蔓看看两人，悄悄把自己那杯水端起来，停止继续爆料。</w:t>
       </w:r>
     </w:p>
     <w:p>
@@ -3108,7 +3206,7 @@
         <w:t>苏蔓：</w:t>
       </w:r>
       <w:r>
-        <w:t>她说那是反诈演练。</w:t>
+        <w:t>行，你俩售后挺配套。</w:t>
       </w:r>
     </w:p>
     <w:p>
@@ -3116,67 +3214,7 @@
         <w:rPr>
           <w:color w:val="4D5860"/>
         </w:rPr>
-        <w:t>△ 半秒安静。温书窈维持住微笑，沈既白放下水杯。</w:t>
-      </w:r>
-    </w:p>
-    <w:p>
-      <w:r>
-        <w:rPr>
-          <w:b/>
-        </w:rPr>
-        <w:t>沈既白：</w:t>
-      </w:r>
-      <w:r>
-        <w:t>我把辞职信发给过董事长。</w:t>
-      </w:r>
-    </w:p>
-    <w:p>
-      <w:r>
-        <w:rPr>
-          <w:color w:val="4D5860"/>
-        </w:rPr>
-        <w:t>△ 两个女孩同时看向他。</w:t>
-      </w:r>
-    </w:p>
-    <w:p>
-      <w:r>
-        <w:rPr>
-          <w:b/>
-        </w:rPr>
-        <w:t>沈既白：</w:t>
-      </w:r>
-      <w:r>
-        <w:t>演练稿。忘了删收件人。</w:t>
-      </w:r>
-    </w:p>
-    <w:p>
-      <w:r>
-        <w:rPr>
-          <w:b/>
-        </w:rPr>
-        <w:t>温书窈：</w:t>
-      </w:r>
-      <w:r>
-        <w:t>后来呢？</w:t>
-      </w:r>
-    </w:p>
-    <w:p>
-      <w:r>
-        <w:rPr>
-          <w:b/>
-        </w:rPr>
-        <w:t>沈既白：</w:t>
-      </w:r>
-      <w:r>
-        <w:t>他回我，批准。第二天我照常上班。</w:t>
-      </w:r>
-    </w:p>
-    <w:p>
-      <w:r>
-        <w:rPr>
-          <w:color w:val="4D5860"/>
-        </w:rPr>
-        <w:t>△ 女主没忍住笑出声，接着看见他也在笑。</w:t>
+        <w:t>△ 温书窈手机弹出母亲的消息，文件名“云锦坊门店转租方案”。她的笑停了，拇指压住屏幕。</w:t>
       </w:r>
     </w:p>
     <w:p>
@@ -3191,7 +3229,7 @@
         <w:rPr>
           <w:color w:val="926050"/>
         </w:rPr>
-        <w:t>【原来总裁也有撤回不了的人生。】</w:t>
+        <w:t>【还是要把店让出去？】</w:t>
       </w:r>
     </w:p>
     <w:p>
@@ -3199,7 +3237,50 @@
         <w:rPr>
           <w:color w:val="4D5860"/>
         </w:rPr>
-        <w:t>△ 苏蔓看看两人，悄悄把自己那杯水端起来，停止继续爆料。</w:t>
+        <w:t>△ 沈既白正对着她，笑意跟着收住。他没有伸手拿她的手机。</w:t>
+      </w:r>
+    </w:p>
+    <w:p>
+      <w:r>
+        <w:t>剪辑点：她抬头时，他已经恢复平静，给她留出开口的空间。</w:t>
+      </w:r>
+    </w:p>
+    <w:p>
+      <w:r>
+        <w:t>制作提示：辞职旧事设为男主在接任负责人之前发生，后续人物履历不要写成他从未有过上级。苏蔓只泄露轻度糗事，不破坏朋友信任。</w:t>
+      </w:r>
+    </w:p>
+    <w:p>
+      <w:pPr>
+        <w:pStyle w:val="Heading2"/>
+        <w:pageBreakBefore/>
+      </w:pPr>
+      <w:r>
+        <w:t>第8集《我来应聘》</w:t>
+      </w:r>
+    </w:p>
+    <w:p>
+      <w:pPr>
+        <w:keepNext/>
+      </w:pPr>
+      <w:r>
+        <w:t>本集目标：女主明确要的是什么；男主支持她的选择，而不是抢走问题的解决权。</w:t>
+      </w:r>
+    </w:p>
+    <w:p>
+      <w:pPr>
+        <w:keepNext/>
+      </w:pPr>
+      <w:r>
+        <w:t>时间预算：0–20 秒母女谈经营机会；20–42 秒男主提出帮忙；42–67 秒女主争取正式渠道；67–88 秒拿出真准备。</w:t>
+      </w:r>
+    </w:p>
+    <w:p>
+      <w:pPr>
+        <w:keepNext/>
+      </w:pPr>
+      <w:r>
+        <w:t>场景：第七集当晚，沈宅·书房门口与室内。女主结束与母亲的通话后敲门进入。</w:t>
       </w:r>
     </w:p>
     <w:p>
@@ -3207,10 +3288,21 @@
         <w:rPr>
           <w:b/>
         </w:rPr>
-        <w:t>苏蔓：</w:t>
-      </w:r>
-      <w:r>
-        <w:t>行，你俩售后挺配套。</w:t>
+        <w:t>温母（电话音）：</w:t>
+      </w:r>
+      <w:r>
+        <w:t>店不是不能留。你要试一个月，就拿出新订单，别只说舍不得。</w:t>
+      </w:r>
+    </w:p>
+    <w:p>
+      <w:r>
+        <w:rPr>
+          <w:b/>
+        </w:rPr>
+        <w:t>温书窈：</w:t>
+      </w:r>
+      <w:r>
+        <w:t>好。给我一个月。</w:t>
       </w:r>
     </w:p>
     <w:p>
@@ -3218,7 +3310,37 @@
         <w:rPr>
           <w:color w:val="4D5860"/>
         </w:rPr>
-        <w:t>△ 温书窈手机弹出母亲的消息，文件名“云锦坊门店转租方案”。她的笑停了，拇指压住屏幕。</w:t>
+        <w:t>△ 她挂断电话，抱着资料进书房。沈既白示意她坐。</w:t>
+      </w:r>
+    </w:p>
+    <w:p>
+      <w:r>
+        <w:rPr>
+          <w:b/>
+        </w:rPr>
+        <w:t>沈既白：</w:t>
+      </w:r>
+      <w:r>
+        <w:t>店的事，需要帮忙？</w:t>
+      </w:r>
+    </w:p>
+    <w:p>
+      <w:r>
+        <w:rPr>
+          <w:b/>
+        </w:rPr>
+        <w:t>温书窈：</w:t>
+      </w:r>
+      <w:r>
+        <w:t>需要。</w:t>
+      </w:r>
+    </w:p>
+    <w:p>
+      <w:r>
+        <w:rPr>
+          <w:color w:val="4D5860"/>
+        </w:rPr>
+        <w:t>△ 他把手边的工作放下。</w:t>
       </w:r>
     </w:p>
     <w:p>
@@ -3233,7 +3355,18 @@
         <w:rPr>
           <w:color w:val="926050"/>
         </w:rPr>
-        <w:t>【还是要把店让出去？】</w:t>
+        <w:t>【别说你买下来。千万别。】</w:t>
+      </w:r>
+    </w:p>
+    <w:p>
+      <w:r>
+        <w:rPr>
+          <w:b/>
+        </w:rPr>
+        <w:t>沈既白：</w:t>
+      </w:r>
+      <w:r>
+        <w:t>你希望我做什么？</w:t>
       </w:r>
     </w:p>
     <w:p>
@@ -3241,61 +3374,7 @@
         <w:rPr>
           <w:color w:val="4D5860"/>
         </w:rPr>
-        <w:t>△ 沈既白正对着她，笑意跟着收住。他没有伸手拿她的手机。</w:t>
-      </w:r>
-    </w:p>
-    <w:p>
-      <w:r>
-        <w:t>剪辑点：她抬头时，他已经恢复平静，给她留出开口的空间。</w:t>
-      </w:r>
-    </w:p>
-    <w:p>
-      <w:r>
-        <w:t>制作提示：辞职旧事设为男主在接任负责人之前发生，后续人物履历不要写成他从未有过上级。苏蔓只泄露轻度糗事，不破坏朋友信任。</w:t>
-      </w:r>
-    </w:p>
-    <w:p>
-      <w:pPr>
-        <w:pStyle w:val="Heading2"/>
-        <w:pageBreakBefore/>
-      </w:pPr>
-      <w:r>
-        <w:t>第8集《我来应聘》</w:t>
-      </w:r>
-    </w:p>
-    <w:p>
-      <w:pPr>
-        <w:keepNext/>
-      </w:pPr>
-      <w:r>
-        <w:t>本集目标：女主明确要的是什么；男主支持她的选择，而不是抢走问题的解决权。</w:t>
-      </w:r>
-    </w:p>
-    <w:p>
-      <w:pPr>
-        <w:keepNext/>
-      </w:pPr>
-      <w:r>
-        <w:t>时间预算：0–20 秒母女谈经营机会；20–42 秒男主提出帮忙；42–67 秒女主争取正式渠道；67–88 秒拿出真准备。</w:t>
-      </w:r>
-    </w:p>
-    <w:p>
-      <w:pPr>
-        <w:keepNext/>
-      </w:pPr>
-      <w:r>
-        <w:t>场景：第七集当晚，沈宅·书房门口与室内。女主结束与母亲的通话后敲门进入。</w:t>
-      </w:r>
-    </w:p>
-    <w:p>
-      <w:r>
-        <w:rPr>
-          <w:b/>
-        </w:rPr>
-        <w:t>温母（电话音）：</w:t>
-      </w:r>
-      <w:r>
-        <w:t>店不是不能留。你要试一个月，就拿出新订单，别只说舍不得。</w:t>
+        <w:t>△ 她原本准备解释的话停住，重新坐稳。</w:t>
       </w:r>
     </w:p>
     <w:p>
@@ -3306,15 +3385,7 @@
         <w:t>温书窈：</w:t>
       </w:r>
       <w:r>
-        <w:t>好。给我一个月。</w:t>
-      </w:r>
-    </w:p>
-    <w:p>
-      <w:r>
-        <w:rPr>
-          <w:color w:val="4D5860"/>
-        </w:rPr>
-        <w:t>△ 她挂断电话，抱着资料进书房。沈既白示意她坐。</w:t>
+        <w:t>你们在选季度客户礼。我想提一个方案。</w:t>
       </w:r>
     </w:p>
     <w:p>
@@ -3325,7 +3396,7 @@
         <w:t>沈既白：</w:t>
       </w:r>
       <w:r>
-        <w:t>店的事，需要帮忙？</w:t>
+        <w:t>顾言之告诉你的？</w:t>
       </w:r>
     </w:p>
     <w:p>
@@ -3336,7 +3407,7 @@
         <w:t>温书窈：</w:t>
       </w:r>
       <w:r>
-        <w:t>需要。</w:t>
+        <w:t>公司公开征集。我昨天就下载了需求。</w:t>
       </w:r>
     </w:p>
     <w:p>
@@ -3344,7 +3415,18 @@
         <w:rPr>
           <w:color w:val="4D5860"/>
         </w:rPr>
-        <w:t>△ 他把手边的工作放下。</w:t>
+        <w:t>△ 她把准备好的纸张推过来，上面是双面真丝长巾与简洁包装的示意图。</w:t>
+      </w:r>
+    </w:p>
+    <w:p>
+      <w:r>
+        <w:rPr>
+          <w:b/>
+        </w:rPr>
+        <w:t>温书窈：</w:t>
+      </w:r>
+      <w:r>
+        <w:t>样品、报价、交期，我都按要求来。你帮我约负责的人。</w:t>
       </w:r>
     </w:p>
     <w:p>
@@ -3359,7 +3441,15 @@
         <w:rPr>
           <w:color w:val="926050"/>
         </w:rPr>
-        <w:t>【别说你买下来。千万别。】</w:t>
+        <w:t>【给我考场，别替我填答案。】</w:t>
+      </w:r>
+    </w:p>
+    <w:p>
+      <w:r>
+        <w:rPr>
+          <w:color w:val="4D5860"/>
+        </w:rPr>
+        <w:t>△ 他看完最上面一页，拿起手机。</w:t>
       </w:r>
     </w:p>
     <w:p>
@@ -3370,7 +3460,7 @@
         <w:t>沈既白：</w:t>
       </w:r>
       <w:r>
-        <w:t>你希望我做什么？</w:t>
+        <w:t>顾言之，约采购和行政负责人。按正常流程看样。</w:t>
       </w:r>
     </w:p>
     <w:p>
@@ -3378,7 +3468,18 @@
         <w:rPr>
           <w:color w:val="4D5860"/>
         </w:rPr>
-        <w:t>△ 她原本准备解释的话停住，重新坐稳。</w:t>
+        <w:t>△ 他放下手机，看见她终于松了一口气。</w:t>
+      </w:r>
+    </w:p>
+    <w:p>
+      <w:r>
+        <w:rPr>
+          <w:b/>
+        </w:rPr>
+        <w:t>沈既白：</w:t>
+      </w:r>
+      <w:r>
+        <w:t>还有呢？</w:t>
       </w:r>
     </w:p>
     <w:p>
@@ -3389,48 +3490,7 @@
         <w:t>温书窈：</w:t>
       </w:r>
       <w:r>
-        <w:t>你们在选季度客户礼。我想提一个方案。</w:t>
-      </w:r>
-    </w:p>
-    <w:p>
-      <w:r>
-        <w:rPr>
-          <w:b/>
-        </w:rPr>
-        <w:t>沈既白：</w:t>
-      </w:r>
-      <w:r>
-        <w:t>顾言之告诉你的？</w:t>
-      </w:r>
-    </w:p>
-    <w:p>
-      <w:r>
-        <w:rPr>
-          <w:b/>
-        </w:rPr>
-        <w:t>温书窈：</w:t>
-      </w:r>
-      <w:r>
-        <w:t>公司公开征集。我昨天就下载了需求。</w:t>
-      </w:r>
-    </w:p>
-    <w:p>
-      <w:r>
-        <w:rPr>
-          <w:color w:val="4D5860"/>
-        </w:rPr>
-        <w:t>△ 她把准备好的纸张推过来，上面是双面真丝长巾与简洁包装的示意图。</w:t>
-      </w:r>
-    </w:p>
-    <w:p>
-      <w:r>
-        <w:rPr>
-          <w:b/>
-        </w:rPr>
-        <w:t>温书窈：</w:t>
-      </w:r>
-      <w:r>
-        <w:t>样品、报价、交期，我都按要求来。你帮我约负责的人。</w:t>
+        <w:t>你能先听我试讲一次吗？</w:t>
       </w:r>
     </w:p>
     <w:p>
@@ -3445,15 +3505,7 @@
         <w:rPr>
           <w:color w:val="926050"/>
         </w:rPr>
-        <w:t>【给我考场，别替我填答案。】</w:t>
-      </w:r>
-    </w:p>
-    <w:p>
-      <w:r>
-        <w:rPr>
-          <w:color w:val="4D5860"/>
-        </w:rPr>
-        <w:t>△ 他看完最上面一页，拿起手机。</w:t>
+        <w:t>【免费的甲方，不用白不用。】</w:t>
       </w:r>
     </w:p>
     <w:p>
@@ -3464,26 +3516,7 @@
         <w:t>沈既白：</w:t>
       </w:r>
       <w:r>
-        <w:t>顾言之，约采购和行政负责人。按正常流程看样。</w:t>
-      </w:r>
-    </w:p>
-    <w:p>
-      <w:r>
-        <w:rPr>
-          <w:color w:val="4D5860"/>
-        </w:rPr>
-        <w:t>△ 他放下手机，看见她终于松了一口气。</w:t>
-      </w:r>
-    </w:p>
-    <w:p>
-      <w:r>
-        <w:rPr>
-          <w:b/>
-        </w:rPr>
-        <w:t>沈既白：</w:t>
-      </w:r>
-      <w:r>
-        <w:t>还有呢？</w:t>
+        <w:t>半小时。可以问难题？</w:t>
       </w:r>
     </w:p>
     <w:p>
@@ -3494,7 +3527,7 @@
         <w:t>温书窈：</w:t>
       </w:r>
       <w:r>
-        <w:t>你能先听我试讲一次吗？</w:t>
+        <w:t>可以。</w:t>
       </w:r>
     </w:p>
     <w:p>
@@ -3509,7 +3542,61 @@
         <w:rPr>
           <w:color w:val="926050"/>
         </w:rPr>
-        <w:t>【免费的甲方，不用白不用。】</w:t>
+        <w:t>【刚给梯子，怎么又搬出考卷。】</w:t>
+      </w:r>
+    </w:p>
+    <w:p>
+      <w:r>
+        <w:t>剪辑点：他翻开笔记本，认真坐到她对面；她也挺直了背。</w:t>
+      </w:r>
+    </w:p>
+    <w:p>
+      <w:r>
+        <w:t>制作提示：书房内先明确两人面对面，再出现男主可见弹幕。母女电话段没有男主读心反应。女主的准备通过两页资料体现，不临时生成完整企业转型方案。</w:t>
+      </w:r>
+    </w:p>
+    <w:p>
+      <w:pPr>
+        <w:pStyle w:val="Heading2"/>
+        <w:pageBreakBefore/>
+      </w:pPr>
+      <w:r>
+        <w:t>第9集《老板也要答题》</w:t>
+      </w:r>
+    </w:p>
+    <w:p>
+      <w:pPr>
+        <w:keepNext/>
+      </w:pPr>
+      <w:r>
+        <w:t>本集目标：女主展示专业能力，男主从宠她转为认真尊重她的判断；完成一次可笑也有效的试讲。</w:t>
+      </w:r>
+    </w:p>
+    <w:p>
+      <w:pPr>
+        <w:keepNext/>
+      </w:pPr>
+      <w:r>
+        <w:t>时间预算：0–20 秒华丽话术被问住；20–45 秒女主反问真实需求；45–72 秒修正产品方案；72–90 秒正式验样到来。</w:t>
+      </w:r>
+    </w:p>
+    <w:p>
+      <w:pPr>
+        <w:keepNext/>
+      </w:pPr>
+      <w:r>
+        <w:t>场景：承接上一集，沈宅·书房。同一张桌，摆放女主从云锦坊带回的现有长巾样品和可替换包装。</w:t>
+      </w:r>
+    </w:p>
+    <w:p>
+      <w:r>
+        <w:rPr>
+          <w:b/>
+        </w:rPr>
+        <w:t>温书窈：</w:t>
+      </w:r>
+      <w:r>
+        <w:t>这款产品承载了百年审美与——</w:t>
       </w:r>
     </w:p>
     <w:p>
@@ -3520,18 +3607,15 @@
         <w:t>沈既白：</w:t>
       </w:r>
       <w:r>
-        <w:t>半小时。可以问难题？</w:t>
+        <w:t>客户为什么要用？</w:t>
       </w:r>
     </w:p>
     <w:p>
       <w:r>
         <w:rPr>
-          <w:b/>
+          <w:color w:val="4D5860"/>
         </w:rPr>
-        <w:t>温书窈：</w:t>
-      </w:r>
-      <w:r>
-        <w:t>可以。</w:t>
+        <w:t>△ 她准备翻页的手停住。</w:t>
       </w:r>
     </w:p>
     <w:p>
@@ -3546,50 +3630,7 @@
         <w:rPr>
           <w:color w:val="926050"/>
         </w:rPr>
-        <w:t>【刚给梯子，怎么又搬出考卷。】</w:t>
-      </w:r>
-    </w:p>
-    <w:p>
-      <w:r>
-        <w:t>剪辑点：他翻开笔记本，认真坐到她对面；她也挺直了背。</w:t>
-      </w:r>
-    </w:p>
-    <w:p>
-      <w:r>
-        <w:t>制作提示：书房内先明确两人面对面，再出现男主可见弹幕。母女电话段没有男主读心反应。女主的准备通过两页资料体现，不临时生成完整企业转型方案。</w:t>
-      </w:r>
-    </w:p>
-    <w:p>
-      <w:pPr>
-        <w:pStyle w:val="Heading2"/>
-        <w:pageBreakBefore/>
-      </w:pPr>
-      <w:r>
-        <w:t>第9集《老板也要答题》</w:t>
-      </w:r>
-    </w:p>
-    <w:p>
-      <w:pPr>
-        <w:keepNext/>
-      </w:pPr>
-      <w:r>
-        <w:t>本集目标：女主展示专业能力，男主从宠她转为认真尊重她的判断；完成一次可笑也有效的试讲。</w:t>
-      </w:r>
-    </w:p>
-    <w:p>
-      <w:pPr>
-        <w:keepNext/>
-      </w:pPr>
-      <w:r>
-        <w:t>时间预算：0–20 秒华丽话术被问住；20–45 秒女主反问真实需求；45–72 秒修正产品方案；72–90 秒正式验样到来。</w:t>
-      </w:r>
-    </w:p>
-    <w:p>
-      <w:pPr>
-        <w:keepNext/>
-      </w:pPr>
-      <w:r>
-        <w:t>场景：承接上一集，沈宅·书房。同一张桌，摆放女主从云锦坊带回的现有长巾样品和可替换包装。</w:t>
+        <w:t>【广告刚开场，甲方就按跳过。】</w:t>
       </w:r>
     </w:p>
     <w:p>
@@ -3600,7 +3641,7 @@
         <w:t>温书窈：</w:t>
       </w:r>
       <w:r>
-        <w:t>这款产品承载了百年审美与——</w:t>
+        <w:t>沈先生上次收到的商务礼，拆了吗？</w:t>
       </w:r>
     </w:p>
     <w:p>
@@ -3611,7 +3652,29 @@
         <w:t>沈既白：</w:t>
       </w:r>
       <w:r>
-        <w:t>客户为什么要用？</w:t>
+        <w:t>没。</w:t>
+      </w:r>
+    </w:p>
+    <w:p>
+      <w:r>
+        <w:rPr>
+          <w:b/>
+        </w:rPr>
+        <w:t>温书窈：</w:t>
+      </w:r>
+      <w:r>
+        <w:t>为什么？</w:t>
+      </w:r>
+    </w:p>
+    <w:p>
+      <w:r>
+        <w:rPr>
+          <w:b/>
+        </w:rPr>
+        <w:t>沈既白：</w:t>
+      </w:r>
+      <w:r>
+        <w:t>盒子太大，不想带。</w:t>
       </w:r>
     </w:p>
     <w:p>
@@ -3619,7 +3682,59 @@
         <w:rPr>
           <w:color w:val="4D5860"/>
         </w:rPr>
-        <w:t>△ 她准备翻页的手停住。</w:t>
+        <w:t>△ 她点头，把高而硬的展示盒从样品旁拿走，留下折叠纸套。</w:t>
+      </w:r>
+    </w:p>
+    <w:p>
+      <w:r>
+        <w:rPr>
+          <w:b/>
+        </w:rPr>
+        <w:t>温书窈：</w:t>
+      </w:r>
+      <w:r>
+        <w:t>那就不送一只需要供起来的盒子。</w:t>
+      </w:r>
+    </w:p>
+    <w:p>
+      <w:r>
+        <w:rPr>
+          <w:color w:val="4D5860"/>
+        </w:rPr>
+        <w:t>△ 她拿出双面长巾。镜头切一个已有折叠状态，再切她将巾搭在手提包提手上的成品效果。</w:t>
+      </w:r>
+    </w:p>
+    <w:p>
+      <w:r>
+        <w:rPr>
+          <w:b/>
+        </w:rPr>
+        <w:t>温书窈：</w:t>
+      </w:r>
+      <w:r>
+        <w:t>出差能带，空调房能用。两面配色，男女都能选。先做五十套试单，十四天交付。</w:t>
+      </w:r>
+    </w:p>
+    <w:p>
+      <w:r>
+        <w:rPr>
+          <w:b/>
+        </w:rPr>
+        <w:t>沈既白：</w:t>
+      </w:r>
+      <w:r>
+        <w:t>五十套，有现料？</w:t>
+      </w:r>
+    </w:p>
+    <w:p>
+      <w:r>
+        <w:rPr>
+          <w:b/>
+        </w:rPr>
+        <w:t>温书窈：</w:t>
+      </w:r>
+      <w:r>
+        <w:t>有。师傅排期也确认了。报价里的包装费，我现在重算。</w:t>
       </w:r>
     </w:p>
     <w:p>
@@ -3634,7 +3749,26 @@
         <w:rPr>
           <w:color w:val="926050"/>
         </w:rPr>
-        <w:t>【广告刚开场，甲方就按跳过。】</w:t>
+        <w:t>【少赚盒子钱，先赚回头客。】</w:t>
+      </w:r>
+    </w:p>
+    <w:p>
+      <w:r>
+        <w:rPr>
+          <w:color w:val="4D5860"/>
+        </w:rPr>
+        <w:t>△ 他重新看她的方案，这次没有准备下一句刁钻问题。</w:t>
+      </w:r>
+    </w:p>
+    <w:p>
+      <w:r>
+        <w:rPr>
+          <w:b/>
+        </w:rPr>
+        <w:t>沈既白：</w:t>
+      </w:r>
+      <w:r>
+        <w:t>最后一题。为什么选你？</w:t>
       </w:r>
     </w:p>
     <w:p>
@@ -3645,7 +3779,26 @@
         <w:t>温书窈：</w:t>
       </w:r>
       <w:r>
-        <w:t>沈先生上次收到的商务礼，拆了吗？</w:t>
+        <w:t>我敢在交付单上签自己的名字。</w:t>
+      </w:r>
+    </w:p>
+    <w:p>
+      <w:r>
+        <w:rPr>
+          <w:color w:val="4D5860"/>
+        </w:rPr>
+        <w:t>△ 停半秒，她看了他一眼。</w:t>
+      </w:r>
+    </w:p>
+    <w:p>
+      <w:r>
+        <w:rPr>
+          <w:b/>
+        </w:rPr>
+        <w:t>温书窈：</w:t>
+      </w:r>
+      <w:r>
+        <w:t>现在甲方可以给意见了。</w:t>
       </w:r>
     </w:p>
     <w:p>
@@ -3656,7 +3809,77 @@
         <w:t>沈既白：</w:t>
       </w:r>
       <w:r>
-        <w:t>没。</w:t>
+        <w:t>明天带上样品。这个答案，留给采购听。</w:t>
+      </w:r>
+    </w:p>
+    <w:p>
+      <w:r>
+        <w:rPr>
+          <w:color w:val="4D5860"/>
+        </w:rPr>
+        <w:t>△ 他把她被咖啡压住的一张图纸抽出来，展平，认真放在最上面。</w:t>
+      </w:r>
+    </w:p>
+    <w:p>
+      <w:r>
+        <w:t>剪辑点：女主看见这个小动作，第一次没有弹幕，轻轻点头。</w:t>
+      </w:r>
+    </w:p>
+    <w:p>
+      <w:r>
+        <w:t>制作提示：不拍复杂打结示范，使用“展开—已完成用途展示”的两个清楚画面。男主的需求只代表一个真实使用者，正式采购仍需下一集核验。</w:t>
+      </w:r>
+    </w:p>
+    <w:p>
+      <w:pPr>
+        <w:pStyle w:val="Heading2"/>
+        <w:pageBreakBefore/>
+      </w:pPr>
+      <w:r>
+        <w:t>第10集《第一单》</w:t>
+      </w:r>
+    </w:p>
+    <w:p>
+      <w:pPr>
+        <w:keepNext/>
+      </w:pPr>
+      <w:r>
+        <w:t>本集目标：把一轮努力兑现为清楚、有限的成果；第一笔试订单与第一次正式约会形成双重奖励。</w:t>
+      </w:r>
+    </w:p>
+    <w:p>
+      <w:pPr>
+        <w:keepNext/>
+      </w:pPr>
+      <w:r>
+        <w:t>时间预算：0–24 秒采购最后一问；24–48 秒正式试单确认；48–70 秒她主动分享成果；70–90 秒约会抢答。</w:t>
+      </w:r>
+    </w:p>
+    <w:p>
+      <w:pPr>
+        <w:keepNext/>
+      </w:pPr>
+      <w:r>
+        <w:t>场景一：次日上午，视界科技·小会议室。采购与行政负责人在画外，不需新增正面人物。沈既白坐侧前方旁听，顾言之负责记录。</w:t>
+      </w:r>
+    </w:p>
+    <w:p>
+      <w:r>
+        <w:rPr>
+          <w:color w:val="4D5860"/>
+        </w:rPr>
+        <w:t>△ 桌上已摆好样品、修改后的包装和一页报价。女主听完对方最后一个问题。</w:t>
+      </w:r>
+    </w:p>
+    <w:p>
+      <w:r>
+        <w:rPr>
+          <w:b/>
+        </w:rPr>
+        <w:t>采购负责人（画外音）：</w:t>
+      </w:r>
+      <w:r>
+        <w:t>如果成品和样品不一样？</w:t>
       </w:r>
     </w:p>
     <w:p>
@@ -3667,7 +3890,15 @@
         <w:t>温书窈：</w:t>
       </w:r>
       <w:r>
-        <w:t>为什么？</w:t>
+        <w:t>封样留档，按样验收。哪件不合格，我们承担返工费用。写进合同。</w:t>
+      </w:r>
+    </w:p>
+    <w:p>
+      <w:r>
+        <w:rPr>
+          <w:color w:val="4D5860"/>
+        </w:rPr>
+        <w:t>△ 男主看着她，没有代答。顾言之将双方确认页推过去。</w:t>
       </w:r>
     </w:p>
     <w:p>
@@ -3675,18 +3906,10 @@
         <w:rPr>
           <w:b/>
         </w:rPr>
-        <w:t>沈既白：</w:t>
-      </w:r>
-      <w:r>
-        <w:t>盒子太大，不想带。</w:t>
-      </w:r>
-    </w:p>
-    <w:p>
-      <w:r>
-        <w:rPr>
-          <w:color w:val="4D5860"/>
-        </w:rPr>
-        <w:t>△ 她点头，把高而硬的展示盒从样品旁拿走，留下折叠纸套。</w:t>
+        <w:t>采购负责人（画外音）：</w:t>
+      </w:r>
+      <w:r>
+        <w:t>样品、报价、排期都确认了。五十套试单，十四天交付，三成预付款。验收后再谈后续。</w:t>
       </w:r>
     </w:p>
     <w:p>
@@ -3697,48 +3920,7 @@
         <w:t>温书窈：</w:t>
       </w:r>
       <w:r>
-        <w:t>那就不送一只需要供起来的盒子。</w:t>
-      </w:r>
-    </w:p>
-    <w:p>
-      <w:r>
-        <w:rPr>
-          <w:color w:val="4D5860"/>
-        </w:rPr>
-        <w:t>△ 她拿出双面长巾。镜头切一个已有折叠状态，再切她将巾搭在手提包提手上的成品效果。</w:t>
-      </w:r>
-    </w:p>
-    <w:p>
-      <w:r>
-        <w:rPr>
-          <w:b/>
-        </w:rPr>
-        <w:t>温书窈：</w:t>
-      </w:r>
-      <w:r>
-        <w:t>出差能带，空调房能用。两面配色，男女都能选。先做五十套试单，十四天交付。</w:t>
-      </w:r>
-    </w:p>
-    <w:p>
-      <w:r>
-        <w:rPr>
-          <w:b/>
-        </w:rPr>
-        <w:t>沈既白：</w:t>
-      </w:r>
-      <w:r>
-        <w:t>五十套，有现料？</w:t>
-      </w:r>
-    </w:p>
-    <w:p>
-      <w:r>
-        <w:rPr>
-          <w:b/>
-        </w:rPr>
-        <w:t>温书窈：</w:t>
-      </w:r>
-      <w:r>
-        <w:t>有。师傅排期也确认了。报价里的包装费，我现在重算。</w:t>
+        <w:t>好。</w:t>
       </w:r>
     </w:p>
     <w:p>
@@ -3753,7 +3935,7 @@
         <w:rPr>
           <w:color w:val="926050"/>
         </w:rPr>
-        <w:t>【少赚盒子钱，先赚回头客。】</w:t>
+        <w:t>【五十套。是我的第一单。】</w:t>
       </w:r>
     </w:p>
     <w:p>
@@ -3761,7 +3943,23 @@
         <w:rPr>
           <w:color w:val="4D5860"/>
         </w:rPr>
-        <w:t>△ 他重新看她的方案，这次没有准备下一句刁钻问题。</w:t>
+        <w:t>△ 她在供应商确认处签字。沈既白看见字，笑意慢慢浮出来。</w:t>
+      </w:r>
+    </w:p>
+    <w:p>
+      <w:pPr>
+        <w:keepNext/>
+      </w:pPr>
+      <w:r>
+        <w:t>场景二：同日，会议室外的休息区。只需一面干净背景，与会议室共用光线。</w:t>
+      </w:r>
+    </w:p>
+    <w:p>
+      <w:r>
+        <w:rPr>
+          <w:color w:val="4D5860"/>
+        </w:rPr>
+        <w:t>△ 女主给母亲发送确认页照片，消息只显示：“一个月，我开始了。”随即锁屏，没有等待表扬。</w:t>
       </w:r>
     </w:p>
     <w:p>
@@ -3772,7 +3970,7 @@
         <w:t>沈既白：</w:t>
       </w:r>
       <w:r>
-        <w:t>最后一题。为什么选你？</w:t>
+        <w:t>温老板，恭喜。</w:t>
       </w:r>
     </w:p>
     <w:p>
@@ -3783,7 +3981,7 @@
         <w:t>温书窈：</w:t>
       </w:r>
       <w:r>
-        <w:t>我敢在交付单上签自己的名字。</w:t>
+        <w:t>现在恭喜一半。交好货，再恭喜另一半。</w:t>
       </w:r>
     </w:p>
     <w:p>
@@ -3791,7 +3989,7 @@
         <w:rPr>
           <w:color w:val="4D5860"/>
         </w:rPr>
-        <w:t>△ 停半秒，她看了他一眼。</w:t>
+        <w:t>△ 他点头。她从资料袋中取出一条她配色的领带，递过去。</w:t>
       </w:r>
     </w:p>
     <w:p>
@@ -3802,7 +4000,7 @@
         <w:t>温书窈：</w:t>
       </w:r>
       <w:r>
-        <w:t>现在甲方可以给意见了。</w:t>
+        <w:t>陪练费。不是采购回扣。</w:t>
       </w:r>
     </w:p>
     <w:p>
@@ -3813,77 +4011,7 @@
         <w:t>沈既白：</w:t>
       </w:r>
       <w:r>
-        <w:t>明天带上样品。这个答案，留给采购听。</w:t>
-      </w:r>
-    </w:p>
-    <w:p>
-      <w:r>
-        <w:rPr>
-          <w:color w:val="4D5860"/>
-        </w:rPr>
-        <w:t>△ 他把她被咖啡压住的一张图纸抽出来，展平，认真放在最上面。</w:t>
-      </w:r>
-    </w:p>
-    <w:p>
-      <w:r>
-        <w:t>剪辑点：女主看见这个小动作，第一次没有弹幕，轻轻点头。</w:t>
-      </w:r>
-    </w:p>
-    <w:p>
-      <w:r>
-        <w:t>制作提示：不拍复杂打结示范，使用“展开—已完成用途展示”的两个清楚画面。男主的需求只代表一个真实使用者，正式采购仍需下一集核验。</w:t>
-      </w:r>
-    </w:p>
-    <w:p>
-      <w:pPr>
-        <w:pStyle w:val="Heading2"/>
-        <w:pageBreakBefore/>
-      </w:pPr>
-      <w:r>
-        <w:t>第10集《第一单》</w:t>
-      </w:r>
-    </w:p>
-    <w:p>
-      <w:pPr>
-        <w:keepNext/>
-      </w:pPr>
-      <w:r>
-        <w:t>本集目标：把一轮努力兑现为清楚、有限的成果；第一笔试订单与第一次正式约会形成双重奖励。</w:t>
-      </w:r>
-    </w:p>
-    <w:p>
-      <w:pPr>
-        <w:keepNext/>
-      </w:pPr>
-      <w:r>
-        <w:t>时间预算：0–24 秒采购最后一问；24–48 秒正式试单确认；48–70 秒她主动分享成果；70–90 秒约会抢答。</w:t>
-      </w:r>
-    </w:p>
-    <w:p>
-      <w:pPr>
-        <w:keepNext/>
-      </w:pPr>
-      <w:r>
-        <w:t>场景一：次日上午，视界科技·小会议室。采购与行政负责人在画外，不需新增正面人物。沈既白坐侧前方旁听，顾言之负责记录。</w:t>
-      </w:r>
-    </w:p>
-    <w:p>
-      <w:r>
-        <w:rPr>
-          <w:color w:val="4D5860"/>
-        </w:rPr>
-        <w:t>△ 桌上已摆好样品、修改后的包装和一页报价。女主听完对方最后一个问题。</w:t>
-      </w:r>
-    </w:p>
-    <w:p>
-      <w:r>
-        <w:rPr>
-          <w:b/>
-        </w:rPr>
-        <w:t>采购负责人（画外音）：</w:t>
-      </w:r>
-      <w:r>
-        <w:t>如果成品和样品不一样？</w:t>
+        <w:t>分得这么清？</w:t>
       </w:r>
     </w:p>
     <w:p>
@@ -3894,37 +4022,7 @@
         <w:t>温书窈：</w:t>
       </w:r>
       <w:r>
-        <w:t>封样留档，按样验收。哪件不合格，我们承担返工费用。写进合同。</w:t>
-      </w:r>
-    </w:p>
-    <w:p>
-      <w:r>
-        <w:rPr>
-          <w:color w:val="4D5860"/>
-        </w:rPr>
-        <w:t>△ 男主看着她，没有代答。顾言之将双方确认页推过去。</w:t>
-      </w:r>
-    </w:p>
-    <w:p>
-      <w:r>
-        <w:rPr>
-          <w:b/>
-        </w:rPr>
-        <w:t>采购负责人（画外音）：</w:t>
-      </w:r>
-      <w:r>
-        <w:t>样品、报价、排期都确认了。五十套试单，十四天交付，三成预付款。验收后再谈后续。</w:t>
-      </w:r>
-    </w:p>
-    <w:p>
-      <w:r>
-        <w:rPr>
-          <w:b/>
-        </w:rPr>
-        <w:t>温书窈：</w:t>
-      </w:r>
-      <w:r>
-        <w:t>好。</w:t>
+        <w:t>当然。今晚我请你吃饭。</w:t>
       </w:r>
     </w:p>
     <w:p>
@@ -3939,7 +4037,7 @@
         <w:rPr>
           <w:color w:val="926050"/>
         </w:rPr>
-        <w:t>【五十套。是我的第一单。】</w:t>
+        <w:t>【得挑他也爱吃的。别又辣得偷偷喝奶。】</w:t>
       </w:r>
     </w:p>
     <w:p>
@@ -3947,23 +4045,7 @@
         <w:rPr>
           <w:color w:val="4D5860"/>
         </w:rPr>
-        <w:t>△ 她在供应商确认处签字。沈既白看见字，笑意慢慢浮出来。</w:t>
-      </w:r>
-    </w:p>
-    <w:p>
-      <w:pPr>
-        <w:keepNext/>
-      </w:pPr>
-      <w:r>
-        <w:t>场景二：同日，会议室外的休息区。只需一面干净背景，与会议室共用光线。</w:t>
-      </w:r>
-    </w:p>
-    <w:p>
-      <w:r>
-        <w:rPr>
-          <w:color w:val="4D5860"/>
-        </w:rPr>
-        <w:t>△ 女主给母亲发送确认页照片，消息只显示：“一个月，我开始了。”随即锁屏，没有等待表扬。</w:t>
+        <w:t>△ 他接过领带，看见她是认认真真地在考虑自己。</w:t>
       </w:r>
     </w:p>
     <w:p>
@@ -3974,7 +4056,7 @@
         <w:t>沈既白：</w:t>
       </w:r>
       <w:r>
-        <w:t>温老板，恭喜。</w:t>
+        <w:t>就我们两个？</w:t>
       </w:r>
     </w:p>
     <w:p>
@@ -3985,48 +4067,7 @@
         <w:t>温书窈：</w:t>
       </w:r>
       <w:r>
-        <w:t>现在恭喜一半。交好货，再恭喜另一半。</w:t>
-      </w:r>
-    </w:p>
-    <w:p>
-      <w:r>
-        <w:rPr>
-          <w:color w:val="4D5860"/>
-        </w:rPr>
-        <w:t>△ 他点头。她从资料袋中取出一条她配色的领带，递过去。</w:t>
-      </w:r>
-    </w:p>
-    <w:p>
-      <w:r>
-        <w:rPr>
-          <w:b/>
-        </w:rPr>
-        <w:t>温书窈：</w:t>
-      </w:r>
-      <w:r>
-        <w:t>陪练费。不是采购回扣。</w:t>
-      </w:r>
-    </w:p>
-    <w:p>
-      <w:r>
-        <w:rPr>
-          <w:b/>
-        </w:rPr>
-        <w:t>沈既白：</w:t>
-      </w:r>
-      <w:r>
-        <w:t>分得这么清？</w:t>
-      </w:r>
-    </w:p>
-    <w:p>
-      <w:r>
-        <w:rPr>
-          <w:b/>
-        </w:rPr>
-        <w:t>温书窈：</w:t>
-      </w:r>
-      <w:r>
-        <w:t>当然。今晚我请你吃饭。</w:t>
+        <w:t>庆功嘛。</w:t>
       </w:r>
     </w:p>
     <w:p>
@@ -4041,15 +4082,7 @@
         <w:rPr>
           <w:color w:val="926050"/>
         </w:rPr>
-        <w:t>【得挑他也爱吃的。别又辣得偷偷喝奶。】</w:t>
-      </w:r>
-    </w:p>
-    <w:p>
-      <w:r>
-        <w:rPr>
-          <w:color w:val="4D5860"/>
-        </w:rPr>
-        <w:t>△ 他接过领带，看见她是认认真真地在考虑自己。</w:t>
+        <w:t>【只有两个人，那不就是约会？】</w:t>
       </w:r>
     </w:p>
     <w:p>
@@ -4060,18 +4093,15 @@
         <w:t>沈既白：</w:t>
       </w:r>
       <w:r>
-        <w:t>就我们两个？</w:t>
+        <w:t>嗯，约会。</w:t>
       </w:r>
     </w:p>
     <w:p>
       <w:r>
         <w:rPr>
-          <w:b/>
+          <w:color w:val="4D5860"/>
         </w:rPr>
-        <w:t>温书窈：</w:t>
-      </w:r>
-      <w:r>
-        <w:t>庆功嘛。</w:t>
+        <w:t>△ 她抬头，仔细看着他。他意识到自己又抢了半拍。</w:t>
       </w:r>
     </w:p>
     <w:p>
@@ -4086,7 +4116,45 @@
         <w:rPr>
           <w:color w:val="926050"/>
         </w:rPr>
-        <w:t>【只有两个人，那不就是约会？】</w:t>
+        <w:t>【我刚才……有出声吗？】</w:t>
+      </w:r>
+    </w:p>
+    <w:p>
+      <w:r>
+        <w:t>剪辑点：他没有移开视线，她先忍不住笑了一下。保留疑问，也给本阶段一个真实的甜收口。</w:t>
+      </w:r>
+    </w:p>
+    <w:p>
+      <w:r>
+        <w:t>制作提示：合同金额不在本集临时放大。试订单不等于完成交付、预付款到账或老店已经复兴；这些是后续需要实际完成的任务。</w:t>
+      </w:r>
+    </w:p>
+    <w:p>
+      <w:pPr>
+        <w:pStyle w:val="Heading1"/>
+        <w:pageBreakBefore/>
+      </w:pPr>
+      <w:r>
+        <w:t>六、第十集结束时的连续性档案</w:t>
+      </w:r>
+    </w:p>
+    <w:p>
+      <w:pPr>
+        <w:pStyle w:val="Heading2"/>
+      </w:pPr>
+      <w:r>
+        <w:t>人物已知与未知</w:t>
+      </w:r>
+    </w:p>
+    <w:p>
+      <w:r>
+        <w:rPr>
+          <w:b/>
+        </w:rPr>
+        <w:t>温书窈：</w:t>
+      </w:r>
+      <w:r>
+        <w:t>知道丈夫会维护自己，尊重她的专业，也有怕辣、不会缝扣子等生活弱点。她对丈夫有好感，开始主动照顾和邀请他。对几次“过于精准的回答”起疑，但尚未证明读心。已经获得母亲一个月的试经营机会，拿下第一笔试订单。</w:t>
       </w:r>
     </w:p>
     <w:p>
@@ -4097,40 +4165,167 @@
         <w:t>沈既白：</w:t>
       </w:r>
       <w:r>
-        <w:t>嗯，约会。</w:t>
-      </w:r>
-    </w:p>
-    <w:p>
-      <w:r>
-        <w:rPr>
-          <w:color w:val="4D5860"/>
-        </w:rPr>
-        <w:t>△ 她抬头，仔细看着他。他意识到自己又抢了半拍。</w:t>
+        <w:t>知道自己只能看到女主同场、无遮挡时的即时强念头，已确认不是所有人都会出现文字。他喜欢她的幽默和能力，但没有向她公开能力。知道她的订单目标来自她本人陈述和正式资料，不靠远程读取手机或母女通话。</w:t>
       </w:r>
     </w:p>
     <w:p>
       <w:r>
         <w:rPr>
           <w:b/>
-          <w:color w:val="926050"/>
         </w:rPr>
-        <w:t>弹幕：</w:t>
-      </w:r>
+        <w:t>顾言之：</w:t>
+      </w:r>
+      <w:r>
+        <w:t>不知道读心，只知道老板对夫人明显上心。负责协调和记录，未替公司跳过采购程序。</w:t>
+      </w:r>
+    </w:p>
+    <w:p>
       <w:r>
         <w:rPr>
-          <w:color w:val="926050"/>
+          <w:b/>
         </w:rPr>
-        <w:t>【我刚才……有出声吗？】</w:t>
-      </w:r>
-    </w:p>
-    <w:p>
-      <w:r>
-        <w:t>剪辑点：他没有移开视线，她先忍不住笑了一下。保留疑问，也给本阶段一个真实的甜收口。</w:t>
-      </w:r>
-    </w:p>
-    <w:p>
-      <w:r>
-        <w:t>制作提示：合同金额不在本集临时放大。试订单不等于完成交付、预付款到账或老店已经复兴；这些是后续需要实际完成的任务。</w:t>
+        <w:t>温母：</w:t>
+      </w:r>
+      <w:r>
+        <w:t>知道女儿得到一个月试经营机会，也收到首单确认页；尚未有交货成果可据以判断长期经营能力。</w:t>
+      </w:r>
+    </w:p>
+    <w:p>
+      <w:r>
+        <w:rPr>
+          <w:b/>
+        </w:rPr>
+        <w:t>苏蔓：</w:t>
+      </w:r>
+      <w:r>
+        <w:t>知道女主在丈夫面前会真笑，男主会主动替她圆场；不知道能力。</w:t>
+      </w:r>
+    </w:p>
+    <w:p>
+      <w:r>
+        <w:rPr>
+          <w:b/>
+        </w:rPr>
+        <w:t>林楚楚：</w:t>
+      </w:r>
+      <w:r>
+        <w:t>第五集被客气地请去泡茶，只知道两人会互相配合；尚未参与云锦坊订单或后续经营。</w:t>
+      </w:r>
+    </w:p>
+    <w:p>
+      <w:pPr>
+        <w:pStyle w:val="Heading2"/>
+      </w:pPr>
+      <w:r>
+        <w:t>道具与事实</w:t>
+      </w:r>
+    </w:p>
+    <w:p>
+      <w:pPr>
+        <w:pStyle w:val="ListBullet"/>
+      </w:pPr>
+      <w:r>
+        <w:t>第一集玉佩触发一次能力，保存在沈宅，不是随身开关。</w:t>
+      </w:r>
+    </w:p>
+    <w:p>
+      <w:pPr>
+        <w:pStyle w:val="ListBullet"/>
+      </w:pPr>
+      <w:r>
+        <w:t>第一集男主自己选择沙发，前十集没有无交代地改成共枕而眠。</w:t>
+      </w:r>
+    </w:p>
+    <w:p>
+      <w:pPr>
+        <w:pStyle w:val="ListBullet"/>
+      </w:pPr>
+      <w:r>
+        <w:t>第二集女主知道男主怕辣，第六集点心与第十集庆功选择回收这件事。</w:t>
+      </w:r>
+    </w:p>
+    <w:p>
+      <w:pPr>
+        <w:pStyle w:val="ListBullet"/>
+      </w:pPr>
+      <w:r>
+        <w:t>第三集女主展现审美与色卡习惯，第六集展现基本手艺，第八至十集才让这些能力进入正式方案。</w:t>
+      </w:r>
+    </w:p>
+    <w:p>
+      <w:pPr>
+        <w:pStyle w:val="ListBullet"/>
+      </w:pPr>
+      <w:r>
+        <w:t>第三集浅杏上衣被奶茶洒湿，第四集换恐龙家居服有明确原因。</w:t>
+      </w:r>
+    </w:p>
+    <w:p>
+      <w:pPr>
+        <w:pStyle w:val="ListBullet"/>
+      </w:pPr>
+      <w:r>
+        <w:t>第五集袖扣脱落，第六集修好，后续不能继续当作未修好的道具。</w:t>
+      </w:r>
+    </w:p>
+    <w:p>
+      <w:pPr>
+        <w:pStyle w:val="ListBullet"/>
+      </w:pPr>
+      <w:r>
+        <w:t>第七集转租方案只是经营选项；第八集争取到一个月试经营。没有既定大额债务突然被消除。</w:t>
+      </w:r>
+    </w:p>
+    <w:p>
+      <w:pPr>
+        <w:pStyle w:val="ListBullet"/>
+      </w:pPr>
+      <w:r>
+        <w:t>第九集已确认五十套的现有面料与排期；第十集仍是样品、报价与交期审核后的试订单。</w:t>
+      </w:r>
+    </w:p>
+    <w:p>
+      <w:pPr>
+        <w:pStyle w:val="ListBullet"/>
+      </w:pPr>
+      <w:r>
+        <w:t>第十集赠送的领带来自女主现有样品与配色，不要求她在一夜间新造整条供应链。</w:t>
+      </w:r>
+    </w:p>
+    <w:p>
+      <w:pPr>
+        <w:pStyle w:val="ListBullet"/>
+      </w:pPr>
+      <w:r>
+        <w:t>第十集五十套、十四天、三成预付款是合同安排；签字不代表已经收到钱，也不代表全部交付。</w:t>
+      </w:r>
+    </w:p>
+    <w:p>
+      <w:pPr>
+        <w:pStyle w:val="Heading2"/>
+      </w:pPr>
+      <w:r>
+        <w:t>后续主线预留</w:t>
+      </w:r>
+    </w:p>
+    <w:p>
+      <w:r>
+        <w:t>第一段：第一次约会，双方继续误解和互相照顾；订单交付中出现能由女主解决的小问题，男主学习不过度介入。</w:t>
+      </w:r>
+    </w:p>
+    <w:p>
+      <w:r>
+        <w:t>第二段：女主对抢答积累出有根据的怀疑，设计一个真正能检验“他能否看见我心里指定内容”的实验。揭晓不机械拖到某个很晚的集数。</w:t>
+      </w:r>
+    </w:p>
+    <w:p>
+      <w:r>
+        <w:t>第三段：能力公开后，女主先羞恼、再开始故意在心里逗他；两人约定他可以看见，但重要决定需要她真正说出口。喜剧从“他藏秘密”换成“两人都知道这件事后的互相试探”。</w:t>
+      </w:r>
+    </w:p>
+    <w:p>
+      <w:r>
+        <w:t>第四段：女主逐渐能直接表达想要什么，男主也敢主动表达。他不用每次等到她心里打分才行动。最终心动落点是：他看不见她的脸、收不到弹幕时，仍知道如何尊重和回应她。</w:t>
       </w:r>
     </w:p>
     <w:p>
@@ -4139,7 +4334,7 @@
         <w:pageBreakBefore/>
       </w:pPr>
       <w:r>
-        <w:t>六、第十集结束时的连续性档案</w:t>
+        <w:t>七、从剧本到 AI 试播：下一步先做什么</w:t>
       </w:r>
     </w:p>
     <w:p>
@@ -4147,73 +4342,41 @@
         <w:pStyle w:val="Heading2"/>
       </w:pPr>
       <w:r>
-        <w:t>人物已知与未知</w:t>
-      </w:r>
-    </w:p>
-    <w:p>
-      <w:r>
-        <w:rPr>
-          <w:b/>
-        </w:rPr>
-        <w:t>温书窈：</w:t>
-      </w:r>
-      <w:r>
-        <w:t>知道丈夫会维护自己，尊重她的专业，也有怕辣、不会缝扣子等生活弱点。她对丈夫有好感，开始主动照顾和邀请他。对几次“过于精准的回答”起疑，但尚未证明读心。已经获得母亲一个月的试经营机会，拿下第一笔试订单。</w:t>
-      </w:r>
-    </w:p>
-    <w:p>
-      <w:r>
-        <w:rPr>
-          <w:b/>
-        </w:rPr>
-        <w:t>沈既白：</w:t>
-      </w:r>
-      <w:r>
-        <w:t>知道自己只能看到女主同场、无遮挡时的即时强念头，已确认不是所有人都会出现文字。他喜欢她的幽默和能力，但没有向她公开能力。知道她的订单目标来自她本人陈述和正式资料，不靠远程读取手机或母女通话。</w:t>
-      </w:r>
-    </w:p>
-    <w:p>
-      <w:r>
-        <w:rPr>
-          <w:b/>
-        </w:rPr>
-        <w:t>顾言之：</w:t>
-      </w:r>
-      <w:r>
-        <w:t>不知道读心，只知道老板对夫人明显上心。负责协调和记录，未替公司跳过采购程序。</w:t>
-      </w:r>
-    </w:p>
-    <w:p>
-      <w:r>
-        <w:rPr>
-          <w:b/>
-        </w:rPr>
-        <w:t>温母：</w:t>
-      </w:r>
-      <w:r>
-        <w:t>知道女儿得到一个月试经营机会，也收到首单确认页；尚未有交货成果可据以判断长期经营能力。</w:t>
-      </w:r>
-    </w:p>
-    <w:p>
-      <w:r>
-        <w:rPr>
-          <w:b/>
-        </w:rPr>
-        <w:t>苏蔓：</w:t>
-      </w:r>
-      <w:r>
-        <w:t>知道女主在丈夫面前会真笑，男主会主动替她圆场；不知道能力。</w:t>
-      </w:r>
-    </w:p>
-    <w:p>
-      <w:r>
-        <w:rPr>
-          <w:b/>
-        </w:rPr>
-        <w:t>林楚楚：</w:t>
-      </w:r>
-      <w:r>
-        <w:t>第五集被客气地请去泡茶，只知道两人会互相配合；尚未参与云锦坊订单或后续经营。</w:t>
+        <w:t>已确认的制作顺序</w:t>
+      </w:r>
+    </w:p>
+    <w:p>
+      <w:r>
+        <w:t>按用户确认，将原来的“①配音试读、②人物定妆、③分镜与样片”调整为“②→③→①”。具体执行如下。</w:t>
+      </w:r>
+    </w:p>
+    <w:p>
+      <w:pPr>
+        <w:ind w:left="340" w:hanging="340"/>
+      </w:pPr>
+      <w:r>
+        <w:t>1. 人物定妆与人物卡（原第②步）。先为男女主各做少量定妆候选，比较脸、气质、同框与关键表情，确定一对后建立正面、侧面、全身及表情参考组。采用现代都市、半写实影视质感与克制喜剧表演；按用户确认使用 16:9 横屏画幅，沈宅以深木与米灰为主，肤色和光线保持温暖。男女主形象已确认沿用定妆提案 A。配角按第一集需要补充，同时建立婚房场景卡、服装卡和玉佩道具卡。</w:t>
+      </w:r>
+    </w:p>
+    <w:p>
+      <w:pPr>
+        <w:ind w:left="340" w:hanging="340"/>
+      </w:pPr>
+      <w:r>
+        <w:t>2. 第一集分镜与画面样片（原第③步）。按本轮确认安排 24 个镜头、约 75 秒，先出静帧分镜，再测试三至五秒的短镜头，优先验证正反打、同框脸部一致性、手持纸张、轻微转身和表情衔接。用文字占位标注对白与弹幕的出现位置，保留镜头长度和剪辑顺序的调整空间。此阶段形成画面样片，最终口型与时长留待配音阶段校准。</w:t>
+      </w:r>
+    </w:p>
+    <w:p>
+      <w:pPr>
+        <w:ind w:left="340" w:hanging="340"/>
+      </w:pPr>
+      <w:r>
+        <w:t>3. 配音试读与节奏校准（原第①步）。对着画面样片朗读公开对白和弹幕，加入看字、反应、转身等必要停顿，校准每个笑点的落点与阅读时间。根据实际配音调整镜头时长、必要的口型同步和剪辑，再加入正式弹幕、对白字幕及音效，输出以 60–90 秒为目标的完整样片。检查笑点是否在字幕读完之后、反应是否及时、人物是否持续像同一个人。</w:t>
+      </w:r>
+    </w:p>
+    <w:p>
+      <w:r>
+        <w:t>完整样片稳定后，再批量生成前十集所需服装、配角与场景资产，并按复用场景组织生产。</w:t>
       </w:r>
     </w:p>
     <w:p>
@@ -4221,7 +4384,7 @@
         <w:pStyle w:val="Heading2"/>
       </w:pPr>
       <w:r>
-        <w:t>道具与事实</w:t>
+        <w:t>第一集最终样片通过标准</w:t>
       </w:r>
     </w:p>
     <w:p>
@@ -4229,7 +4392,7 @@
         <w:pStyle w:val="ListBullet"/>
       </w:pPr>
       <w:r>
-        <w:t>第一集玉佩触发一次能力，保存在沈宅，不是随身开关。</w:t>
+        <w:t>前五秒左右，观众能理解“表面端庄、内心吐槽”的反差。</w:t>
       </w:r>
     </w:p>
     <w:p>
@@ -4237,7 +4400,7 @@
         <w:pStyle w:val="ListBullet"/>
       </w:pPr>
       <w:r>
-        <w:t>第一集男主自己选择沙发，前十集没有无交代地改成共枕而眠。</w:t>
+        <w:t>第一轮弹幕之后的男主反应，能让观众理解他看得见她的秘密。</w:t>
       </w:r>
     </w:p>
     <w:p>
@@ -4245,7 +4408,7 @@
         <w:pStyle w:val="ListBullet"/>
       </w:pPr>
       <w:r>
-        <w:t>第二集女主知道男主怕辣，第六集点心与第十集庆功选择回收这件事。</w:t>
+        <w:t>每条主要弹幕都留出阅读和反应时间，没有一边听长对白、一边读另一条新信息。</w:t>
       </w:r>
     </w:p>
     <w:p>
@@ -4253,7 +4416,7 @@
         <w:pStyle w:val="ListBullet"/>
       </w:pPr>
       <w:r>
-        <w:t>第三集女主展现审美与色卡习惯，第六集展现基本手艺，第八至十集才让这些能力进入正式方案。</w:t>
+        <w:t>“门禁差评—改成报备”这个笑点在一集内兑现。</w:t>
       </w:r>
     </w:p>
     <w:p>
@@ -4261,7 +4424,7 @@
         <w:pStyle w:val="ListBullet"/>
       </w:pPr>
       <w:r>
-        <w:t>第三集浅杏上衣被奶茶洒湿，第四集换恐龙家居服有明确原因。</w:t>
+        <w:t>结尾保留“她是否说漏嘴”的期待，同时本集已交付一段完整互动。</w:t>
       </w:r>
     </w:p>
     <w:p>
@@ -4269,7 +4432,7 @@
         <w:pStyle w:val="ListBullet"/>
       </w:pPr>
       <w:r>
-        <w:t>第五集袖扣脱落，第六集修好，后续不能继续当作未修好的道具。</w:t>
+        <w:t>实际配音加必要动作达到 60–90 秒。超时先删重复解释与反应，不把所有声音机械加速。</w:t>
       </w:r>
     </w:p>
     <w:p>
@@ -4277,59 +4440,7 @@
         <w:pStyle w:val="ListBullet"/>
       </w:pPr>
       <w:r>
-        <w:t>第七集转租方案只是经营选项；第八集争取到一个月试经营。没有既定大额债务突然被消除。</w:t>
-      </w:r>
-    </w:p>
-    <w:p>
-      <w:pPr>
-        <w:pStyle w:val="ListBullet"/>
-      </w:pPr>
-      <w:r>
-        <w:t>第九集已确认五十套的现有面料与排期；第十集仍是样品、报价与交期审核后的试订单。</w:t>
-      </w:r>
-    </w:p>
-    <w:p>
-      <w:pPr>
-        <w:pStyle w:val="ListBullet"/>
-      </w:pPr>
-      <w:r>
-        <w:t>第十集赠送的领带来自女主现有样品与配色，不要求她在一夜间新造整条供应链。</w:t>
-      </w:r>
-    </w:p>
-    <w:p>
-      <w:pPr>
-        <w:pStyle w:val="ListBullet"/>
-      </w:pPr>
-      <w:r>
-        <w:t>第十集五十套、十四天、三成预付款是合同安排；签字不代表已经收到钱，也不代表全部交付。</w:t>
-      </w:r>
-    </w:p>
-    <w:p>
-      <w:pPr>
-        <w:pStyle w:val="Heading2"/>
-      </w:pPr>
-      <w:r>
-        <w:t>后续主线预留</w:t>
-      </w:r>
-    </w:p>
-    <w:p>
-      <w:r>
-        <w:t>第一段：第一次约会，双方继续误解和互相照顾；订单交付中出现能由女主解决的小问题，男主学习不过度介入。</w:t>
-      </w:r>
-    </w:p>
-    <w:p>
-      <w:r>
-        <w:t>第二段：女主对抢答积累出有根据的怀疑，设计一个真正能检验“他能否看见我心里指定内容”的实验。揭晓不机械拖到某个很晚的集数。</w:t>
-      </w:r>
-    </w:p>
-    <w:p>
-      <w:r>
-        <w:t>第三段：能力公开后，女主先羞恼、再开始故意在心里逗他；两人约定他可以看见，但重要决定需要她真正说出口。喜剧从“他藏秘密”换成“两人都知道这件事后的互相试探”。</w:t>
-      </w:r>
-    </w:p>
-    <w:p>
-      <w:r>
-        <w:t>第四段：女主逐渐能直接表达想要什么，男主也敢主动表达。他不用每次等到她心里打分才行动。最终心动落点是：他看不见她的脸、收不到弹幕时，仍知道如何尊重和回应她。</w:t>
+        <w:t>不用平台播放量或完播率承诺代替试播验证。</w:t>
       </w:r>
     </w:p>
     <w:p>
@@ -4338,7 +4449,12 @@
         <w:pageBreakBefore/>
       </w:pPr>
       <w:r>
-        <w:t>七、从剧本到 AI 试播：下一步先做什么</w:t>
+        <w:t>八、人物视觉卡文字底稿</w:t>
+      </w:r>
+    </w:p>
+    <w:p>
+      <w:r>
+        <w:t>这是下一轮生成定妆图的输入草案，不代表已生成图像，也不预设必须使用某家工具。形象采用独立原创设计，不绑定现成影视角色或具体演员的脸。</w:t>
       </w:r>
     </w:p>
     <w:p>
@@ -4346,41 +4462,27 @@
         <w:pStyle w:val="Heading2"/>
       </w:pPr>
       <w:r>
-        <w:t>已确认的制作顺序</w:t>
-      </w:r>
-    </w:p>
-    <w:p>
-      <w:r>
-        <w:t>按用户确认，将原来的“①配音试读、②人物定妆、③分镜与样片”调整为“②→③→①”。具体执行如下。</w:t>
-      </w:r>
-    </w:p>
-    <w:p>
-      <w:pPr>
-        <w:ind w:left="340" w:hanging="340"/>
-      </w:pPr>
-      <w:r>
-        <w:t>1. 人物定妆与人物卡（原第②步）。先为男女主各做少量定妆候选，比较脸、气质、同框与关键表情，确定一对后建立正面、侧面、全身及表情参考组。建议采用现代都市、半写实影视质感与克制喜剧表演；使用 9:16 画幅，沈宅以深木与米灰为主，肤色和光线保持温暖。视觉风格仍需通过定妆测试确定。配角按第一集需要补充，同时建立婚房场景卡、服装卡和玉佩道具卡。</w:t>
-      </w:r>
-    </w:p>
-    <w:p>
-      <w:pPr>
-        <w:ind w:left="340" w:hanging="340"/>
-      </w:pPr>
-      <w:r>
-        <w:t>2. 第一集分镜与画面样片（原第③步）。安排约 10–14 个镜头，先出静帧分镜，再测试三至五秒的短镜头，优先验证正反打、同框脸部一致性、手持纸张、轻微转身和表情衔接。用文字占位标注对白与弹幕的出现位置，保留镜头长度和剪辑顺序的调整空间。此阶段形成画面样片，最终口型与时长留待配音阶段校准。</w:t>
-      </w:r>
-    </w:p>
-    <w:p>
-      <w:pPr>
-        <w:ind w:left="340" w:hanging="340"/>
-      </w:pPr>
-      <w:r>
-        <w:t>3. 配音试读与节奏校准（原第①步）。对着画面样片朗读公开对白和弹幕，加入看字、反应、转身等必要停顿，校准每个笑点的落点与阅读时间。根据实际配音调整镜头时长、必要的口型同步和剪辑，再加入正式弹幕、对白字幕及音效，输出以 60–90 秒为目标的完整样片。检查笑点是否在字幕读完之后、反应是否及时、人物是否持续像同一个人。</w:t>
-      </w:r>
-    </w:p>
-    <w:p>
-      <w:r>
-        <w:t>完整样片稳定后，再批量生成前十集所需服装、配角与场景资产，并按复用场景组织生产。</w:t>
+        <w:t>温书窈的视觉识别</w:t>
+      </w:r>
+    </w:p>
+    <w:p>
+      <w:r>
+        <w:t>年龄感：明确成年，约二十六岁。脸型清秀但不幼态，眼神灵，营业笑与真笑能区分。避免表情僵硬、过度磨皮造成“只能拍海报”。</w:t>
+      </w:r>
+    </w:p>
+    <w:p>
+      <w:r>
+        <w:t>头发：深棕至黑色中长发；正式场合低盘发，居家放下或松束。固定分缝与发际线特征，变化只发生在已登记的发型版本中。</w:t>
+      </w:r>
+    </w:p>
+    <w:p>
+      <w:r>
+        <w:t>色彩与服装：正式造型以米白、浅杏、低饱和藕粉为主；第五集可用一套简洁端庄的浅色裙装；恐龙睡衣是第四集专属反差资产。关键在同一张脸换状态，不能靠完全变脸制造反差。</w:t>
+      </w:r>
+    </w:p>
+    <w:p>
+      <w:r>
+        <w:t>首轮必要表情：标准礼貌笑、嘴角不动但眼神吐槽、突然警觉、忍笑失败、认真做事、受到照顾后的短暂愣神。</w:t>
       </w:r>
     </w:p>
     <w:p>
@@ -4388,7 +4490,35 @@
         <w:pStyle w:val="Heading2"/>
       </w:pPr>
       <w:r>
-        <w:t>第一集最终样片通过标准</w:t>
+        <w:t>沈既白的视觉识别</w:t>
+      </w:r>
+    </w:p>
+    <w:p>
+      <w:r>
+        <w:t>年龄感：明确成年，约二十九岁。五官利落，有亲近时可见的柔和感，不能始终像愤怒或威胁别人。</w:t>
+      </w:r>
+    </w:p>
+    <w:p>
+      <w:r>
+        <w:t>头发与轮廓：短黑发，发型整洁稳定；下颌轮廓清楚，避免每个镜头改变鼻梁与眉形。</w:t>
+      </w:r>
+    </w:p>
+    <w:p>
+      <w:r>
+        <w:t>色彩与服装：深灰、藏蓝西装与素色衬衫；第三集灰、暗红、藏蓝三条领带分开编号，其他服装保持一致。第六集使用浅色家居衬衫，方便呈现防备放下。</w:t>
+      </w:r>
+    </w:p>
+    <w:p>
+      <w:r>
+        <w:t>首轮必要表情：工作状态、看见异常后的微停顿、假装镇定、忍笑、被夸后的不自然、认真听她说话、放松的真笑。</w:t>
+      </w:r>
+    </w:p>
+    <w:p>
+      <w:pPr>
+        <w:pStyle w:val="Heading2"/>
+      </w:pPr>
+      <w:r>
+        <w:t>一张合格人物卡应该包含</w:t>
       </w:r>
     </w:p>
     <w:p>
@@ -4396,7 +4526,7 @@
         <w:pStyle w:val="ListBullet"/>
       </w:pPr>
       <w:r>
-        <w:t>前五秒左右，观众能理解“表面端庄、内心吐槽”的反差。</w:t>
+        <w:t>固定主参考：正面、左右四分之三侧脸、侧脸、全身，共用一致发型与基准服装。</w:t>
       </w:r>
     </w:p>
     <w:p>
@@ -4404,7 +4534,7 @@
         <w:pStyle w:val="ListBullet"/>
       </w:pPr>
       <w:r>
-        <w:t>第一轮弹幕之后的男主反应，能让观众理解他看得见她的秘密。</w:t>
+        <w:t>表情参考：选取本剧实际需要的表情，宁可少而准确，不用大量极端表情污染角色印象。</w:t>
       </w:r>
     </w:p>
     <w:p>
@@ -4412,7 +4542,7 @@
         <w:pStyle w:val="ListBullet"/>
       </w:pPr>
       <w:r>
-        <w:t>每条主要弹幕都留出阅读和反应时间，没有一边听长对白、一边读另一条新信息。</w:t>
+        <w:t>服装编号：例如 W01 新婚正式服、W02 居家浅杏、W03 恐龙睡衣；S01 深灰西装、S02 家居衬衫。正式编号在试图后统一。</w:t>
       </w:r>
     </w:p>
     <w:p>
@@ -4420,7 +4550,7 @@
         <w:pStyle w:val="ListBullet"/>
       </w:pPr>
       <w:r>
-        <w:t>“门禁差评—改成报备”这个笑点在一集内兑现。</w:t>
+        <w:t>双人关系参考：同框身高差、餐桌坐位、对视距离，确认两人放在同一个画面里仍像同一部剧。</w:t>
       </w:r>
     </w:p>
     <w:p>
@@ -4428,7 +4558,7 @@
         <w:pStyle w:val="ListBullet"/>
       </w:pPr>
       <w:r>
-        <w:t>结尾保留“她是否说漏嘴”的期待，同时本集已交付一段完整互动。</w:t>
+        <w:t>资产记录：保存原图、生成提示词、工具与模型版本、尺寸、参考图来源；工具支持时记录种子和角色引用参数。它们有助于复现，但不能保证视频里永远不变脸。</w:t>
       </w:r>
     </w:p>
     <w:p>
@@ -4436,15 +4566,20 @@
         <w:pStyle w:val="ListBullet"/>
       </w:pPr>
       <w:r>
-        <w:t>实际配音加必要动作达到 60–90 秒。超时先删重复解释与反应，不把所有声音机械加速。</w:t>
+        <w:t>配音参考：在配音试读阶段补充各自一段中性对白、一段喜剧对白；女主另存一段心声。最终应检查两种说话状态仍像同一个人。</w:t>
       </w:r>
     </w:p>
     <w:p>
       <w:pPr>
-        <w:pStyle w:val="ListBullet"/>
+        <w:pStyle w:val="Heading2"/>
       </w:pPr>
       <w:r>
-        <w:t>不用平台播放量或完播率承诺代替试播验证。</w:t>
+        <w:t>暂时不急着做的资产</w:t>
+      </w:r>
+    </w:p>
+    <w:p>
+      <w:r>
+        <w:t>前十集以外的全部配角、城市全景、盛大婚礼、几十套服装和复杂品牌包装，都可在第一集样片通过后按需要补充。当前最有价值的成果是一段角色稳定、弹幕读得清、反应接得上的完整样片。</w:t>
       </w:r>
     </w:p>
     <w:p>
@@ -4453,145 +4588,6 @@
         <w:pageBreakBefore/>
       </w:pPr>
       <w:r>
-        <w:t>八、人物视觉卡文字底稿</w:t>
-      </w:r>
-    </w:p>
-    <w:p>
-      <w:r>
-        <w:t>这是下一轮生成定妆图的输入草案，不代表已生成图像，也不预设必须使用某家工具。形象采用独立原创设计，不绑定现成影视角色或具体演员的脸。</w:t>
-      </w:r>
-    </w:p>
-    <w:p>
-      <w:pPr>
-        <w:pStyle w:val="Heading2"/>
-      </w:pPr>
-      <w:r>
-        <w:t>温书窈的视觉识别</w:t>
-      </w:r>
-    </w:p>
-    <w:p>
-      <w:r>
-        <w:t>年龄感：明确成年，约二十六岁。脸型清秀但不幼态，眼神灵，营业笑与真笑能区分。避免表情僵硬、过度磨皮造成“只能拍海报”。</w:t>
-      </w:r>
-    </w:p>
-    <w:p>
-      <w:r>
-        <w:t>头发：深棕至黑色中长发；正式场合低盘发，居家放下或松束。固定分缝与发际线特征，变化只发生在已登记的发型版本中。</w:t>
-      </w:r>
-    </w:p>
-    <w:p>
-      <w:r>
-        <w:t>色彩与服装：正式造型以米白、浅杏、低饱和藕粉为主；第五集可用一套简洁端庄的浅色裙装；恐龙睡衣是第四集专属反差资产。关键在同一张脸换状态，不能靠完全变脸制造反差。</w:t>
-      </w:r>
-    </w:p>
-    <w:p>
-      <w:r>
-        <w:t>首轮必要表情：标准礼貌笑、嘴角不动但眼神吐槽、突然警觉、忍笑失败、认真做事、受到照顾后的短暂愣神。</w:t>
-      </w:r>
-    </w:p>
-    <w:p>
-      <w:pPr>
-        <w:pStyle w:val="Heading2"/>
-      </w:pPr>
-      <w:r>
-        <w:t>沈既白的视觉识别</w:t>
-      </w:r>
-    </w:p>
-    <w:p>
-      <w:r>
-        <w:t>年龄感：明确成年，约二十九岁。五官利落，有亲近时可见的柔和感，不能始终像愤怒或威胁别人。</w:t>
-      </w:r>
-    </w:p>
-    <w:p>
-      <w:r>
-        <w:t>头发与轮廓：短黑发，发型整洁稳定；下颌轮廓清楚，避免每个镜头改变鼻梁与眉形。</w:t>
-      </w:r>
-    </w:p>
-    <w:p>
-      <w:r>
-        <w:t>色彩与服装：深灰、藏蓝西装与素色衬衫；第三集灰、暗红、藏蓝三条领带分开编号，其他服装保持一致。第六集使用浅色家居衬衫，方便呈现防备放下。</w:t>
-      </w:r>
-    </w:p>
-    <w:p>
-      <w:r>
-        <w:t>首轮必要表情：工作状态、看见异常后的微停顿、假装镇定、忍笑、被夸后的不自然、认真听她说话、放松的真笑。</w:t>
-      </w:r>
-    </w:p>
-    <w:p>
-      <w:pPr>
-        <w:pStyle w:val="Heading2"/>
-      </w:pPr>
-      <w:r>
-        <w:t>一张合格人物卡应该包含</w:t>
-      </w:r>
-    </w:p>
-    <w:p>
-      <w:pPr>
-        <w:pStyle w:val="ListBullet"/>
-      </w:pPr>
-      <w:r>
-        <w:t>固定主参考：正面、左右四分之三侧脸、侧脸、全身，共用一致发型与基准服装。</w:t>
-      </w:r>
-    </w:p>
-    <w:p>
-      <w:pPr>
-        <w:pStyle w:val="ListBullet"/>
-      </w:pPr>
-      <w:r>
-        <w:t>表情参考：选取本剧实际需要的表情，宁可少而准确，不用大量极端表情污染角色印象。</w:t>
-      </w:r>
-    </w:p>
-    <w:p>
-      <w:pPr>
-        <w:pStyle w:val="ListBullet"/>
-      </w:pPr>
-      <w:r>
-        <w:t>服装编号：例如 W01 新婚正式服、W02 居家浅杏、W03 恐龙睡衣；S01 深灰西装、S02 家居衬衫。正式编号在试图后统一。</w:t>
-      </w:r>
-    </w:p>
-    <w:p>
-      <w:pPr>
-        <w:pStyle w:val="ListBullet"/>
-      </w:pPr>
-      <w:r>
-        <w:t>双人关系参考：同框身高差、餐桌坐位、对视距离，确认两人放在同一个画面里仍像同一部剧。</w:t>
-      </w:r>
-    </w:p>
-    <w:p>
-      <w:pPr>
-        <w:pStyle w:val="ListBullet"/>
-      </w:pPr>
-      <w:r>
-        <w:t>资产记录：保存原图、生成提示词、工具与模型版本、尺寸、参考图来源；工具支持时记录种子和角色引用参数。它们有助于复现，但不能保证视频里永远不变脸。</w:t>
-      </w:r>
-    </w:p>
-    <w:p>
-      <w:pPr>
-        <w:pStyle w:val="ListBullet"/>
-      </w:pPr>
-      <w:r>
-        <w:t>配音参考：在配音试读阶段补充各自一段中性对白、一段喜剧对白；女主另存一段心声。最终应检查两种说话状态仍像同一个人。</w:t>
-      </w:r>
-    </w:p>
-    <w:p>
-      <w:pPr>
-        <w:pStyle w:val="Heading2"/>
-      </w:pPr>
-      <w:r>
-        <w:t>暂时不急着做的资产</w:t>
-      </w:r>
-    </w:p>
-    <w:p>
-      <w:r>
-        <w:t>前十集以外的全部配角、城市全景、盛大婚礼、几十套服装和复杂品牌包装，都可在第一集样片通过后按需要补充。当前最有价值的成果是一段角色稳定、弹幕读得清、反应接得上的完整样片。</w:t>
-      </w:r>
-    </w:p>
-    <w:p>
-      <w:pPr>
-        <w:pStyle w:val="Heading1"/>
-        <w:pageBreakBefore/>
-      </w:pPr>
-      <w:r>
         <w:t>九、本次交付与待验证事项</w:t>
       </w:r>
     </w:p>
@@ -4602,7 +4598,7 @@
     </w:p>
     <w:p>
       <w:r>
-        <w:t>尚未发生的制作：人物图像生成、动态分镜与画面样片、配音试读、成片时长实测与平台发布。文稿中的时间预算不是对这些工作的完成声明。</w:t>
+        <w:t>制作进度：男女主定妆提案 A 已确认；第一集已制作 24 镜头的横屏静帧分镜与拍摄说明。动态画面样片、配音试读、成片时长实测与平台发布尚未完成，文稿中的时间仍是剪辑预算。</w:t>
       </w:r>
     </w:p>
     <w:p>
@@ -4648,11 +4644,7 @@
       <w:jc w:val="right"/>
     </w:pPr>
     <w:r>
-      <w:rPr>
-        <w:color w:val="687582"/>
-        <w:sz w:val="16"/>
-      </w:rPr>
-      <w:t>《她头顶有弹幕》 · 第二稿 v2.1 · 创作与试播工作稿</w:t>
+      <w:t>《她头顶有弹幕》 · 第二稿 v2.2 · 创作与试播工作稿</w:t>
     </w:r>
   </w:p>
 </w:hdr>

</xml_diff>